<commit_message>
update docs for further implementation
</commit_message>
<xml_diff>
--- a/docs/sonny-major-release-spec.docx
+++ b/docs/sonny-major-release-spec.docx
@@ -342,6 +342,19 @@
     </w:p>
     <w:p>
       <w:pPr>
+        <w:spacing w:before="0" w:after="120" w:line="300" w:lineRule="auto"/>
+      </w:pPr>
+      <w:r>
+        <w:rPr>
+          <w:rFonts w:ascii="Calibri" w:hAnsi="Calibri"/>
+          <w:color w:val="1E1C1C"/>
+          <w:sz w:val="22"/>
+        </w:rPr>
+        <w:t>Before the major-release roadmap begins, the existing prototype should go through a small but important pre-major-release implementation pass. That pass should make the current hard-edged demos more general: Hacker News becomes general web-to-Markdown research, media result opening becomes real playback where provider APIs allow it, app opening becomes a more general app/action adapter foundation, and the menu-bar popover gains a companion full Mac app for account, settings, privacy, stats, routines, workspaces, and Power Mode controls.</w:t>
+      </w:r>
+    </w:p>
+    <w:p>
+      <w:pPr>
         <w:pStyle w:val="Heading1"/>
       </w:pPr>
       <w:r>
@@ -436,6 +449,45 @@
     </w:p>
     <w:p>
       <w:pPr>
+        <w:spacing w:before="0" w:after="120" w:line="300" w:lineRule="auto"/>
+      </w:pPr>
+      <w:r>
+        <w:rPr>
+          <w:rFonts w:ascii="Calibri" w:hAnsi="Calibri"/>
+          <w:color w:val="1E1C1C"/>
+          <w:sz w:val="22"/>
+        </w:rPr>
+        <w:t>Sonny should also have two native product surfaces:</w:t>
+      </w:r>
+    </w:p>
+    <w:p>
+      <w:pPr>
+        <w:pStyle w:val="ListBullet"/>
+      </w:pPr>
+      <w:r>
+        <w:rPr>
+          <w:rFonts w:ascii="Calibri" w:hAnsi="Calibri"/>
+          <w:color w:val="1E1C1C"/>
+          <w:sz w:val="21"/>
+        </w:rPr>
+        <w:t>Agent cockpit: the menu-bar popover for fast commands, voice, current task state, quick approvals, Power Mode pause/stop, recent outputs, routine launch, and workspace launch.</w:t>
+      </w:r>
+    </w:p>
+    <w:p>
+      <w:pPr>
+        <w:pStyle w:val="ListBullet"/>
+      </w:pPr>
+      <w:r>
+        <w:rPr>
+          <w:rFonts w:ascii="Calibri" w:hAnsi="Calibri"/>
+          <w:color w:val="1E1C1C"/>
+          <w:sz w:val="21"/>
+        </w:rPr>
+        <w:t>Sonny Command Center: the normal Mac app for account, subscription, settings, privacy controls, Data Sent To AI history, routines/workspaces editing, usage and impact stats, Power Mode app approvals, permissions, and enterprise/admin controls later.</w:t>
+      </w:r>
+    </w:p>
+    <w:p>
+      <w:pPr>
         <w:pStyle w:val="Heading2"/>
       </w:pPr>
       <w:r>
@@ -2249,6 +2301,2212 @@
           <w:sz w:val="22"/>
         </w:rPr>
         <w:t>This baseline should be treated as a prototype, not as the public-release architecture. Future implementation must preserve what works while replacing prototype assumptions with production systems: hosted auth, agent traces, capability registry, richer permission model, screen context, Power Mode, backend, subscriptions, and enterprise foundations.</w:t>
+      </w:r>
+    </w:p>
+    <w:p>
+      <w:pPr>
+        <w:spacing w:before="0" w:after="120" w:line="300" w:lineRule="auto"/>
+      </w:pPr>
+      <w:r>
+        <w:rPr>
+          <w:rFonts w:ascii="Calibri" w:hAnsi="Calibri"/>
+          <w:color w:val="1E1C1C"/>
+          <w:sz w:val="22"/>
+        </w:rPr>
+        <w:t>Prototype limitations to resolve before the major release:</w:t>
+      </w:r>
+    </w:p>
+    <w:p>
+      <w:pPr>
+        <w:pStyle w:val="ListBullet"/>
+      </w:pPr>
+      <w:r>
+        <w:rPr>
+          <w:rFonts w:ascii="Calibri" w:hAnsi="Calibri"/>
+          <w:color w:val="1E1C1C"/>
+          <w:sz w:val="21"/>
+        </w:rPr>
+        <w:t>Hacker News is a special-case web workflow; it should become a general web/source-to-Markdown capability.</w:t>
+      </w:r>
+    </w:p>
+    <w:p>
+      <w:pPr>
+        <w:pStyle w:val="ListBullet"/>
+      </w:pPr>
+      <w:r>
+        <w:rPr>
+          <w:rFonts w:ascii="Calibri" w:hAnsi="Calibri"/>
+          <w:color w:val="1E1C1C"/>
+          <w:sz w:val="21"/>
+        </w:rPr>
+        <w:t>Music only opens provider results; it should attempt real playback through first-party provider APIs where available.</w:t>
+      </w:r>
+    </w:p>
+    <w:p>
+      <w:pPr>
+        <w:pStyle w:val="ListBullet"/>
+      </w:pPr>
+      <w:r>
+        <w:rPr>
+          <w:rFonts w:ascii="Calibri" w:hAnsi="Calibri"/>
+          <w:color w:val="1E1C1C"/>
+          <w:sz w:val="21"/>
+        </w:rPr>
+        <w:t>App opening is useful but shallow; it should become the foundation for app adapters and app-scoped actions.</w:t>
+      </w:r>
+    </w:p>
+    <w:p>
+      <w:pPr>
+        <w:pStyle w:val="ListBullet"/>
+      </w:pPr>
+      <w:r>
+        <w:rPr>
+          <w:rFonts w:ascii="Calibri" w:hAnsi="Calibri"/>
+          <w:color w:val="1E1C1C"/>
+          <w:sz w:val="21"/>
+        </w:rPr>
+        <w:t>The menu-bar popover is a strong cockpit, but account, settings, history, stats, privacy, and Power Mode controls need a full Mac app surface.</w:t>
+      </w:r>
+    </w:p>
+    <w:p>
+      <w:pPr>
+        <w:pStyle w:val="ListBullet"/>
+      </w:pPr>
+      <w:r>
+        <w:rPr>
+          <w:rFonts w:ascii="Calibri" w:hAnsi="Calibri"/>
+          <w:color w:val="1E1C1C"/>
+          <w:sz w:val="21"/>
+        </w:rPr>
+        <w:t>Existing local tools are still too prototype-shaped; they need more generic schemas, reusable adapters, and capability-style naming before the hosted runtime work starts.</w:t>
+      </w:r>
+    </w:p>
+    <w:p>
+      <w:pPr>
+        <w:pStyle w:val="Heading1"/>
+      </w:pPr>
+      <w:r>
+        <w:t>4A. Pre-Major-Release Implementation Pass</w:t>
+      </w:r>
+    </w:p>
+    <w:p>
+      <w:pPr>
+        <w:spacing w:before="0" w:after="120" w:line="300" w:lineRule="auto"/>
+      </w:pPr>
+      <w:r>
+        <w:rPr>
+          <w:rFonts w:ascii="Calibri" w:hAnsi="Calibri"/>
+          <w:color w:val="1E1C1C"/>
+          <w:sz w:val="22"/>
+        </w:rPr>
+        <w:t>This pass should happen before the full v1 major-release roadmap. It is intentionally smaller than the major release, but it is strategically important because it turns the existing prototype from a set of impressive demos into a broader local agent foundation.</w:t>
+      </w:r>
+    </w:p>
+    <w:p>
+      <w:pPr>
+        <w:spacing w:before="0" w:after="120" w:line="300" w:lineRule="auto"/>
+      </w:pPr>
+      <w:r>
+        <w:rPr>
+          <w:rFonts w:ascii="Calibri" w:hAnsi="Calibri"/>
+          <w:color w:val="1E1C1C"/>
+          <w:sz w:val="22"/>
+        </w:rPr>
+        <w:t>Goals:</w:t>
+      </w:r>
+    </w:p>
+    <w:p>
+      <w:pPr>
+        <w:pStyle w:val="ListBullet"/>
+      </w:pPr>
+      <w:r>
+        <w:rPr>
+          <w:rFonts w:ascii="Calibri" w:hAnsi="Calibri"/>
+          <w:color w:val="1E1C1C"/>
+          <w:sz w:val="21"/>
+        </w:rPr>
+        <w:t>Preserve every existing working feature.</w:t>
+      </w:r>
+    </w:p>
+    <w:p>
+      <w:pPr>
+        <w:pStyle w:val="ListBullet"/>
+      </w:pPr>
+      <w:r>
+        <w:rPr>
+          <w:rFonts w:ascii="Calibri" w:hAnsi="Calibri"/>
+          <w:color w:val="1E1C1C"/>
+          <w:sz w:val="21"/>
+        </w:rPr>
+        <w:t>Generalize narrow prototype workflows into reusable capabilities.</w:t>
+      </w:r>
+    </w:p>
+    <w:p>
+      <w:pPr>
+        <w:pStyle w:val="ListBullet"/>
+      </w:pPr>
+      <w:r>
+        <w:rPr>
+          <w:rFonts w:ascii="Calibri" w:hAnsi="Calibri"/>
+          <w:color w:val="1E1C1C"/>
+          <w:sz w:val="21"/>
+        </w:rPr>
+        <w:t>Keep the implementation local/prototype-friendly.</w:t>
+      </w:r>
+    </w:p>
+    <w:p>
+      <w:pPr>
+        <w:pStyle w:val="ListBullet"/>
+      </w:pPr>
+      <w:r>
+        <w:rPr>
+          <w:rFonts w:ascii="Calibri" w:hAnsi="Calibri"/>
+          <w:color w:val="1E1C1C"/>
+          <w:sz w:val="21"/>
+        </w:rPr>
+        <w:t>Avoid hosted backend, subscription, enterprise, and full Power Mode work in this pass.</w:t>
+      </w:r>
+    </w:p>
+    <w:p>
+      <w:pPr>
+        <w:pStyle w:val="ListBullet"/>
+      </w:pPr>
+      <w:r>
+        <w:rPr>
+          <w:rFonts w:ascii="Calibri" w:hAnsi="Calibri"/>
+          <w:color w:val="1E1C1C"/>
+          <w:sz w:val="21"/>
+        </w:rPr>
+        <w:t>Prepare names, data structures, and tests so the later capability runtime does not need to undo prototype decisions.</w:t>
+      </w:r>
+    </w:p>
+    <w:p>
+      <w:pPr>
+        <w:pStyle w:val="Heading2"/>
+      </w:pPr>
+      <w:r>
+        <w:t>4A.1 Two-Surface Sonny Product Model</w:t>
+      </w:r>
+    </w:p>
+    <w:p>
+      <w:pPr>
+        <w:spacing w:before="0" w:after="120" w:line="300" w:lineRule="auto"/>
+      </w:pPr>
+      <w:r>
+        <w:rPr>
+          <w:rFonts w:ascii="Calibri" w:hAnsi="Calibri"/>
+          <w:color w:val="1E1C1C"/>
+          <w:sz w:val="22"/>
+        </w:rPr>
+        <w:t>Add a full Mac app companion to the menu-bar popover.</w:t>
+      </w:r>
+    </w:p>
+    <w:p>
+      <w:pPr>
+        <w:spacing w:before="0" w:after="120" w:line="300" w:lineRule="auto"/>
+      </w:pPr>
+      <w:r>
+        <w:rPr>
+          <w:rFonts w:ascii="Calibri" w:hAnsi="Calibri"/>
+          <w:color w:val="1E1C1C"/>
+          <w:sz w:val="22"/>
+        </w:rPr>
+        <w:t>Menu-bar popover remains the agent cockpit:</w:t>
+      </w:r>
+    </w:p>
+    <w:p>
+      <w:pPr>
+        <w:pStyle w:val="ListBullet"/>
+      </w:pPr>
+      <w:r>
+        <w:rPr>
+          <w:rFonts w:ascii="Calibri" w:hAnsi="Calibri"/>
+          <w:color w:val="1E1C1C"/>
+          <w:sz w:val="21"/>
+        </w:rPr>
+        <w:t>Ask Sonny.</w:t>
+      </w:r>
+    </w:p>
+    <w:p>
+      <w:pPr>
+        <w:pStyle w:val="ListBullet"/>
+      </w:pPr>
+      <w:r>
+        <w:rPr>
+          <w:rFonts w:ascii="Calibri" w:hAnsi="Calibri"/>
+          <w:color w:val="1E1C1C"/>
+          <w:sz w:val="21"/>
+        </w:rPr>
+        <w:t>Voice and hotkey.</w:t>
+      </w:r>
+    </w:p>
+    <w:p>
+      <w:pPr>
+        <w:pStyle w:val="ListBullet"/>
+      </w:pPr>
+      <w:r>
+        <w:rPr>
+          <w:rFonts w:ascii="Calibri" w:hAnsi="Calibri"/>
+          <w:color w:val="1E1C1C"/>
+          <w:sz w:val="21"/>
+        </w:rPr>
+        <w:t>Current plan/task progress.</w:t>
+      </w:r>
+    </w:p>
+    <w:p>
+      <w:pPr>
+        <w:pStyle w:val="ListBullet"/>
+      </w:pPr>
+      <w:r>
+        <w:rPr>
+          <w:rFonts w:ascii="Calibri" w:hAnsi="Calibri"/>
+          <w:color w:val="1E1C1C"/>
+          <w:sz w:val="21"/>
+        </w:rPr>
+        <w:t>Quick approvals.</w:t>
+      </w:r>
+    </w:p>
+    <w:p>
+      <w:pPr>
+        <w:pStyle w:val="ListBullet"/>
+      </w:pPr>
+      <w:r>
+        <w:rPr>
+          <w:rFonts w:ascii="Calibri" w:hAnsi="Calibri"/>
+          <w:color w:val="1E1C1C"/>
+          <w:sz w:val="21"/>
+        </w:rPr>
+        <w:t>Power Mode pause/stop later.</w:t>
+      </w:r>
+    </w:p>
+    <w:p>
+      <w:pPr>
+        <w:pStyle w:val="ListBullet"/>
+      </w:pPr>
+      <w:r>
+        <w:rPr>
+          <w:rFonts w:ascii="Calibri" w:hAnsi="Calibri"/>
+          <w:color w:val="1E1C1C"/>
+          <w:sz w:val="21"/>
+        </w:rPr>
+        <w:t>Recent results.</w:t>
+      </w:r>
+    </w:p>
+    <w:p>
+      <w:pPr>
+        <w:pStyle w:val="ListBullet"/>
+      </w:pPr>
+      <w:r>
+        <w:rPr>
+          <w:rFonts w:ascii="Calibri" w:hAnsi="Calibri"/>
+          <w:color w:val="1E1C1C"/>
+          <w:sz w:val="21"/>
+        </w:rPr>
+        <w:t>Fast routine/workspace launch.</w:t>
+      </w:r>
+    </w:p>
+    <w:p>
+      <w:pPr>
+        <w:spacing w:before="0" w:after="120" w:line="300" w:lineRule="auto"/>
+      </w:pPr>
+      <w:r>
+        <w:rPr>
+          <w:rFonts w:ascii="Calibri" w:hAnsi="Calibri"/>
+          <w:color w:val="1E1C1C"/>
+          <w:sz w:val="22"/>
+        </w:rPr>
+        <w:t>Full Sonny app becomes the command center:</w:t>
+      </w:r>
+    </w:p>
+    <w:p>
+      <w:pPr>
+        <w:pStyle w:val="ListBullet"/>
+      </w:pPr>
+      <w:r>
+        <w:rPr>
+          <w:rFonts w:ascii="Calibri" w:hAnsi="Calibri"/>
+          <w:color w:val="1E1C1C"/>
+          <w:sz w:val="21"/>
+        </w:rPr>
+        <w:t>Account placeholder and future subscription surface.</w:t>
+      </w:r>
+    </w:p>
+    <w:p>
+      <w:pPr>
+        <w:pStyle w:val="ListBullet"/>
+      </w:pPr>
+      <w:r>
+        <w:rPr>
+          <w:rFonts w:ascii="Calibri" w:hAnsi="Calibri"/>
+          <w:color w:val="1E1C1C"/>
+          <w:sz w:val="21"/>
+        </w:rPr>
+        <w:t>Settings.</w:t>
+      </w:r>
+    </w:p>
+    <w:p>
+      <w:pPr>
+        <w:pStyle w:val="ListBullet"/>
+      </w:pPr>
+      <w:r>
+        <w:rPr>
+          <w:rFonts w:ascii="Calibri" w:hAnsi="Calibri"/>
+          <w:color w:val="1E1C1C"/>
+          <w:sz w:val="21"/>
+        </w:rPr>
+        <w:t>Permission center.</w:t>
+      </w:r>
+    </w:p>
+    <w:p>
+      <w:pPr>
+        <w:pStyle w:val="ListBullet"/>
+      </w:pPr>
+      <w:r>
+        <w:rPr>
+          <w:rFonts w:ascii="Calibri" w:hAnsi="Calibri"/>
+          <w:color w:val="1E1C1C"/>
+          <w:sz w:val="21"/>
+        </w:rPr>
+        <w:t>Privacy controls.</w:t>
+      </w:r>
+    </w:p>
+    <w:p>
+      <w:pPr>
+        <w:pStyle w:val="ListBullet"/>
+      </w:pPr>
+      <w:r>
+        <w:rPr>
+          <w:rFonts w:ascii="Calibri" w:hAnsi="Calibri"/>
+          <w:color w:val="1E1C1C"/>
+          <w:sz w:val="21"/>
+        </w:rPr>
+        <w:t>Data Sent To AI history.</w:t>
+      </w:r>
+    </w:p>
+    <w:p>
+      <w:pPr>
+        <w:pStyle w:val="ListBullet"/>
+      </w:pPr>
+      <w:r>
+        <w:rPr>
+          <w:rFonts w:ascii="Calibri" w:hAnsi="Calibri"/>
+          <w:color w:val="1E1C1C"/>
+          <w:sz w:val="21"/>
+        </w:rPr>
+        <w:t>Routine editor.</w:t>
+      </w:r>
+    </w:p>
+    <w:p>
+      <w:pPr>
+        <w:pStyle w:val="ListBullet"/>
+      </w:pPr>
+      <w:r>
+        <w:rPr>
+          <w:rFonts w:ascii="Calibri" w:hAnsi="Calibri"/>
+          <w:color w:val="1E1C1C"/>
+          <w:sz w:val="21"/>
+        </w:rPr>
+        <w:t>Workspace editor.</w:t>
+      </w:r>
+    </w:p>
+    <w:p>
+      <w:pPr>
+        <w:pStyle w:val="ListBullet"/>
+      </w:pPr>
+      <w:r>
+        <w:rPr>
+          <w:rFonts w:ascii="Calibri" w:hAnsi="Calibri"/>
+          <w:color w:val="1E1C1C"/>
+          <w:sz w:val="21"/>
+        </w:rPr>
+        <w:t>Usage and impact stats.</w:t>
+      </w:r>
+    </w:p>
+    <w:p>
+      <w:pPr>
+        <w:pStyle w:val="ListBullet"/>
+      </w:pPr>
+      <w:r>
+        <w:rPr>
+          <w:rFonts w:ascii="Calibri" w:hAnsi="Calibri"/>
+          <w:color w:val="1E1C1C"/>
+          <w:sz w:val="21"/>
+        </w:rPr>
+        <w:t>Power Mode app approvals later.</w:t>
+      </w:r>
+    </w:p>
+    <w:p>
+      <w:pPr>
+        <w:pStyle w:val="ListBullet"/>
+      </w:pPr>
+      <w:r>
+        <w:rPr>
+          <w:rFonts w:ascii="Calibri" w:hAnsi="Calibri"/>
+          <w:color w:val="1E1C1C"/>
+          <w:sz w:val="21"/>
+        </w:rPr>
+        <w:t>Enterprise/admin controls later.</w:t>
+      </w:r>
+    </w:p>
+    <w:p>
+      <w:pPr>
+        <w:spacing w:before="0" w:after="120" w:line="300" w:lineRule="auto"/>
+      </w:pPr>
+      <w:r>
+        <w:rPr>
+          <w:rFonts w:ascii="Calibri" w:hAnsi="Calibri"/>
+          <w:color w:val="1E1C1C"/>
+          <w:sz w:val="22"/>
+        </w:rPr>
+        <w:t>Initial stats should not feel like surveillance. Track useful aggregate work outcomes, not invasive app monitoring.</w:t>
+      </w:r>
+    </w:p>
+    <w:p>
+      <w:pPr>
+        <w:spacing w:before="0" w:after="120" w:line="300" w:lineRule="auto"/>
+      </w:pPr>
+      <w:r>
+        <w:rPr>
+          <w:rFonts w:ascii="Calibri" w:hAnsi="Calibri"/>
+          <w:color w:val="1E1C1C"/>
+          <w:sz w:val="22"/>
+        </w:rPr>
+        <w:t>Good stats:</w:t>
+      </w:r>
+    </w:p>
+    <w:p>
+      <w:pPr>
+        <w:pStyle w:val="ListBullet"/>
+      </w:pPr>
+      <w:r>
+        <w:rPr>
+          <w:rFonts w:ascii="Calibri" w:hAnsi="Calibri"/>
+          <w:color w:val="1E1C1C"/>
+          <w:sz w:val="21"/>
+        </w:rPr>
+        <w:t>Tasks completed.</w:t>
+      </w:r>
+    </w:p>
+    <w:p>
+      <w:pPr>
+        <w:pStyle w:val="ListBullet"/>
+      </w:pPr>
+      <w:r>
+        <w:rPr>
+          <w:rFonts w:ascii="Calibri" w:hAnsi="Calibri"/>
+          <w:color w:val="1E1C1C"/>
+          <w:sz w:val="21"/>
+        </w:rPr>
+        <w:t>Estimated time saved.</w:t>
+      </w:r>
+    </w:p>
+    <w:p>
+      <w:pPr>
+        <w:pStyle w:val="ListBullet"/>
+      </w:pPr>
+      <w:r>
+        <w:rPr>
+          <w:rFonts w:ascii="Calibri" w:hAnsi="Calibri"/>
+          <w:color w:val="1E1C1C"/>
+          <w:sz w:val="21"/>
+        </w:rPr>
+        <w:t>Files organized, zipped, converted, or summarized.</w:t>
+      </w:r>
+    </w:p>
+    <w:p>
+      <w:pPr>
+        <w:pStyle w:val="ListBullet"/>
+      </w:pPr>
+      <w:r>
+        <w:rPr>
+          <w:rFonts w:ascii="Calibri" w:hAnsi="Calibri"/>
+          <w:color w:val="1E1C1C"/>
+          <w:sz w:val="21"/>
+        </w:rPr>
+        <w:t>Web research notes created.</w:t>
+      </w:r>
+    </w:p>
+    <w:p>
+      <w:pPr>
+        <w:pStyle w:val="ListBullet"/>
+      </w:pPr>
+      <w:r>
+        <w:rPr>
+          <w:rFonts w:ascii="Calibri" w:hAnsi="Calibri"/>
+          <w:color w:val="1E1C1C"/>
+          <w:sz w:val="21"/>
+        </w:rPr>
+        <w:t>Routines run.</w:t>
+      </w:r>
+    </w:p>
+    <w:p>
+      <w:pPr>
+        <w:pStyle w:val="ListBullet"/>
+      </w:pPr>
+      <w:r>
+        <w:rPr>
+          <w:rFonts w:ascii="Calibri" w:hAnsi="Calibri"/>
+          <w:color w:val="1E1C1C"/>
+          <w:sz w:val="21"/>
+        </w:rPr>
+        <w:t>Workspaces opened.</w:t>
+      </w:r>
+    </w:p>
+    <w:p>
+      <w:pPr>
+        <w:pStyle w:val="ListBullet"/>
+      </w:pPr>
+      <w:r>
+        <w:rPr>
+          <w:rFonts w:ascii="Calibri" w:hAnsi="Calibri"/>
+          <w:color w:val="1E1C1C"/>
+          <w:sz w:val="21"/>
+        </w:rPr>
+        <w:t>Apps opened or controlled.</w:t>
+      </w:r>
+    </w:p>
+    <w:p>
+      <w:pPr>
+        <w:pStyle w:val="ListBullet"/>
+      </w:pPr>
+      <w:r>
+        <w:rPr>
+          <w:rFonts w:ascii="Calibri" w:hAnsi="Calibri"/>
+          <w:color w:val="1E1C1C"/>
+          <w:sz w:val="21"/>
+        </w:rPr>
+        <w:t>Power Mode sessions later.</w:t>
+      </w:r>
+    </w:p>
+    <w:p>
+      <w:pPr>
+        <w:pStyle w:val="ListBullet"/>
+      </w:pPr>
+      <w:r>
+        <w:rPr>
+          <w:rFonts w:ascii="Calibri" w:hAnsi="Calibri"/>
+          <w:color w:val="1E1C1C"/>
+          <w:sz w:val="21"/>
+        </w:rPr>
+        <w:t>Approvals requested/granted/denied.</w:t>
+      </w:r>
+    </w:p>
+    <w:p>
+      <w:pPr>
+        <w:pStyle w:val="ListBullet"/>
+      </w:pPr>
+      <w:r>
+        <w:rPr>
+          <w:rFonts w:ascii="Calibri" w:hAnsi="Calibri"/>
+          <w:color w:val="1E1C1C"/>
+          <w:sz w:val="21"/>
+        </w:rPr>
+        <w:t>Failed steps recovered.</w:t>
+      </w:r>
+    </w:p>
+    <w:p>
+      <w:pPr>
+        <w:pStyle w:val="ListBullet"/>
+      </w:pPr>
+      <w:r>
+        <w:rPr>
+          <w:rFonts w:ascii="Calibri" w:hAnsi="Calibri"/>
+          <w:color w:val="1E1C1C"/>
+          <w:sz w:val="21"/>
+        </w:rPr>
+        <w:t>Artifacts created.</w:t>
+      </w:r>
+    </w:p>
+    <w:p>
+      <w:pPr>
+        <w:pStyle w:val="ListBullet"/>
+      </w:pPr>
+      <w:r>
+        <w:rPr>
+          <w:rFonts w:ascii="Calibri" w:hAnsi="Calibri"/>
+          <w:color w:val="1E1C1C"/>
+          <w:sz w:val="21"/>
+        </w:rPr>
+        <w:t>Context packets sent to AI.</w:t>
+      </w:r>
+    </w:p>
+    <w:p>
+      <w:pPr>
+        <w:pStyle w:val="ListBullet"/>
+      </w:pPr>
+      <w:r>
+        <w:rPr>
+          <w:rFonts w:ascii="Calibri" w:hAnsi="Calibri"/>
+          <w:color w:val="1E1C1C"/>
+          <w:sz w:val="21"/>
+        </w:rPr>
+        <w:t>Redactions applied.</w:t>
+      </w:r>
+    </w:p>
+    <w:p>
+      <w:pPr>
+        <w:pStyle w:val="ListBullet"/>
+      </w:pPr>
+      <w:r>
+        <w:rPr>
+          <w:rFonts w:ascii="Calibri" w:hAnsi="Calibri"/>
+          <w:color w:val="1E1C1C"/>
+          <w:sz w:val="21"/>
+        </w:rPr>
+        <w:t>Sensitive actions blocked.</w:t>
+      </w:r>
+    </w:p>
+    <w:p>
+      <w:pPr>
+        <w:pStyle w:val="ListBullet"/>
+      </w:pPr>
+      <w:r>
+        <w:rPr>
+          <w:rFonts w:ascii="Calibri" w:hAnsi="Calibri"/>
+          <w:color w:val="1E1C1C"/>
+          <w:sz w:val="21"/>
+        </w:rPr>
+        <w:t>Most-used workflows.</w:t>
+      </w:r>
+    </w:p>
+    <w:p>
+      <w:pPr>
+        <w:spacing w:before="0" w:after="120" w:line="300" w:lineRule="auto"/>
+      </w:pPr>
+      <w:r>
+        <w:rPr>
+          <w:rFonts w:ascii="Calibri" w:hAnsi="Calibri"/>
+          <w:color w:val="1E1C1C"/>
+          <w:sz w:val="22"/>
+        </w:rPr>
+        <w:t>Avoid:</w:t>
+      </w:r>
+    </w:p>
+    <w:p>
+      <w:pPr>
+        <w:pStyle w:val="ListBullet"/>
+      </w:pPr>
+      <w:r>
+        <w:rPr>
+          <w:rFonts w:ascii="Calibri" w:hAnsi="Calibri"/>
+          <w:color w:val="1E1C1C"/>
+          <w:sz w:val="21"/>
+        </w:rPr>
+        <w:t>Always-on app usage tracking.</w:t>
+      </w:r>
+    </w:p>
+    <w:p>
+      <w:pPr>
+        <w:pStyle w:val="ListBullet"/>
+      </w:pPr>
+      <w:r>
+        <w:rPr>
+          <w:rFonts w:ascii="Calibri" w:hAnsi="Calibri"/>
+          <w:color w:val="1E1C1C"/>
+          <w:sz w:val="21"/>
+        </w:rPr>
+        <w:t>Productivity scoring.</w:t>
+      </w:r>
+    </w:p>
+    <w:p>
+      <w:pPr>
+        <w:pStyle w:val="ListBullet"/>
+      </w:pPr>
+      <w:r>
+        <w:rPr>
+          <w:rFonts w:ascii="Calibri" w:hAnsi="Calibri"/>
+          <w:color w:val="1E1C1C"/>
+          <w:sz w:val="21"/>
+        </w:rPr>
+        <w:t>Raw screen/audio history.</w:t>
+      </w:r>
+    </w:p>
+    <w:p>
+      <w:pPr>
+        <w:pStyle w:val="ListBullet"/>
+      </w:pPr>
+      <w:r>
+        <w:rPr>
+          <w:rFonts w:ascii="Calibri" w:hAnsi="Calibri"/>
+          <w:color w:val="1E1C1C"/>
+          <w:sz w:val="21"/>
+        </w:rPr>
+        <w:t>Storing platform usage in a way that feels like employee monitoring.</w:t>
+      </w:r>
+    </w:p>
+    <w:p>
+      <w:pPr>
+        <w:pStyle w:val="Heading2"/>
+      </w:pPr>
+      <w:r>
+        <w:t>4A.2 General Web-To-Markdown Capability</w:t>
+      </w:r>
+    </w:p>
+    <w:p>
+      <w:pPr>
+        <w:spacing w:before="0" w:after="120" w:line="300" w:lineRule="auto"/>
+      </w:pPr>
+      <w:r>
+        <w:rPr>
+          <w:rFonts w:ascii="Calibri" w:hAnsi="Calibri"/>
+          <w:color w:val="1E1C1C"/>
+          <w:sz w:val="22"/>
+        </w:rPr>
+        <w:t>Replace the Hacker News-specific workflow with a generic web research and Markdown capability. Hacker News should remain as a preset/source adapter, not the only source.</w:t>
+      </w:r>
+    </w:p>
+    <w:p>
+      <w:pPr>
+        <w:spacing w:before="0" w:after="120" w:line="300" w:lineRule="auto"/>
+      </w:pPr>
+      <w:r>
+        <w:rPr>
+          <w:rFonts w:ascii="Calibri" w:hAnsi="Calibri"/>
+          <w:color w:val="1E1C1C"/>
+          <w:sz w:val="22"/>
+        </w:rPr>
+        <w:t>New generalized capabilities:</w:t>
+      </w:r>
+    </w:p>
+    <w:p>
+      <w:pPr>
+        <w:pStyle w:val="ListBullet"/>
+      </w:pPr>
+      <w:r>
+        <w:rPr>
+          <w:rFonts w:ascii="Calibri" w:hAnsi="Calibri"/>
+          <w:color w:val="1E1C1C"/>
+          <w:sz w:val="21"/>
+        </w:rPr>
+        <w:t>Fetch URL.</w:t>
+      </w:r>
+    </w:p>
+    <w:p>
+      <w:pPr>
+        <w:pStyle w:val="ListBullet"/>
+      </w:pPr>
+      <w:r>
+        <w:rPr>
+          <w:rFonts w:ascii="Calibri" w:hAnsi="Calibri"/>
+          <w:color w:val="1E1C1C"/>
+          <w:sz w:val="21"/>
+        </w:rPr>
+        <w:t>Search web through a configured search provider or hosted search later.</w:t>
+      </w:r>
+    </w:p>
+    <w:p>
+      <w:pPr>
+        <w:pStyle w:val="ListBullet"/>
+      </w:pPr>
+      <w:r>
+        <w:rPr>
+          <w:rFonts w:ascii="Calibri" w:hAnsi="Calibri"/>
+          <w:color w:val="1E1C1C"/>
+          <w:sz w:val="21"/>
+        </w:rPr>
+        <w:t>Extract readable article/page content.</w:t>
+      </w:r>
+    </w:p>
+    <w:p>
+      <w:pPr>
+        <w:pStyle w:val="ListBullet"/>
+      </w:pPr>
+      <w:r>
+        <w:rPr>
+          <w:rFonts w:ascii="Calibri" w:hAnsi="Calibri"/>
+          <w:color w:val="1E1C1C"/>
+          <w:sz w:val="21"/>
+        </w:rPr>
+        <w:t>Extract title, author, date, headings, links, images metadata, and citations where available.</w:t>
+      </w:r>
+    </w:p>
+    <w:p>
+      <w:pPr>
+        <w:pStyle w:val="ListBullet"/>
+      </w:pPr>
+      <w:r>
+        <w:rPr>
+          <w:rFonts w:ascii="Calibri" w:hAnsi="Calibri"/>
+          <w:color w:val="1E1C1C"/>
+          <w:sz w:val="21"/>
+        </w:rPr>
+        <w:t>Summarize page or search results.</w:t>
+      </w:r>
+    </w:p>
+    <w:p>
+      <w:pPr>
+        <w:pStyle w:val="ListBullet"/>
+      </w:pPr>
+      <w:r>
+        <w:rPr>
+          <w:rFonts w:ascii="Calibri" w:hAnsi="Calibri"/>
+          <w:color w:val="1E1C1C"/>
+          <w:sz w:val="21"/>
+        </w:rPr>
+        <w:t>Save Markdown.</w:t>
+      </w:r>
+    </w:p>
+    <w:p>
+      <w:pPr>
+        <w:pStyle w:val="ListBullet"/>
+      </w:pPr>
+      <w:r>
+        <w:rPr>
+          <w:rFonts w:ascii="Calibri" w:hAnsi="Calibri"/>
+          <w:color w:val="1E1C1C"/>
+          <w:sz w:val="21"/>
+        </w:rPr>
+        <w:t>Save comparison Markdown from multiple sources.</w:t>
+      </w:r>
+    </w:p>
+    <w:p>
+      <w:pPr>
+        <w:pStyle w:val="ListBullet"/>
+      </w:pPr>
+      <w:r>
+        <w:rPr>
+          <w:rFonts w:ascii="Calibri" w:hAnsi="Calibri"/>
+          <w:color w:val="1E1C1C"/>
+          <w:sz w:val="21"/>
+        </w:rPr>
+        <w:t>Open generated Markdown.</w:t>
+      </w:r>
+    </w:p>
+    <w:p>
+      <w:pPr>
+        <w:pStyle w:val="ListBullet"/>
+      </w:pPr>
+      <w:r>
+        <w:rPr>
+          <w:rFonts w:ascii="Calibri" w:hAnsi="Calibri"/>
+          <w:color w:val="1E1C1C"/>
+          <w:sz w:val="21"/>
+        </w:rPr>
+        <w:t>Reveal generated Markdown in Finder.</w:t>
+      </w:r>
+    </w:p>
+    <w:p>
+      <w:pPr>
+        <w:spacing w:before="0" w:after="120" w:line="300" w:lineRule="auto"/>
+      </w:pPr>
+      <w:r>
+        <w:rPr>
+          <w:rFonts w:ascii="Calibri" w:hAnsi="Calibri"/>
+          <w:color w:val="1E1C1C"/>
+          <w:sz w:val="22"/>
+        </w:rPr>
+        <w:t>Supported inputs:</w:t>
+      </w:r>
+    </w:p>
+    <w:p>
+      <w:pPr>
+        <w:pStyle w:val="ListBullet"/>
+      </w:pPr>
+      <w:r>
+        <w:rPr>
+          <w:rFonts w:ascii="Calibri" w:hAnsi="Calibri"/>
+          <w:color w:val="1E1C1C"/>
+          <w:sz w:val="21"/>
+        </w:rPr>
+        <w:t>Direct URL.</w:t>
+      </w:r>
+    </w:p>
+    <w:p>
+      <w:pPr>
+        <w:pStyle w:val="ListBullet"/>
+      </w:pPr>
+      <w:r>
+        <w:rPr>
+          <w:rFonts w:ascii="Calibri" w:hAnsi="Calibri"/>
+          <w:color w:val="1E1C1C"/>
+          <w:sz w:val="21"/>
+        </w:rPr>
+        <w:t>Natural-language topic.</w:t>
+      </w:r>
+    </w:p>
+    <w:p>
+      <w:pPr>
+        <w:pStyle w:val="ListBullet"/>
+      </w:pPr>
+      <w:r>
+        <w:rPr>
+          <w:rFonts w:ascii="Calibri" w:hAnsi="Calibri"/>
+          <w:color w:val="1E1C1C"/>
+          <w:sz w:val="21"/>
+        </w:rPr>
+        <w:t>Search query.</w:t>
+      </w:r>
+    </w:p>
+    <w:p>
+      <w:pPr>
+        <w:pStyle w:val="ListBullet"/>
+      </w:pPr>
+      <w:r>
+        <w:rPr>
+          <w:rFonts w:ascii="Calibri" w:hAnsi="Calibri"/>
+          <w:color w:val="1E1C1C"/>
+          <w:sz w:val="21"/>
+        </w:rPr>
+        <w:t>Active browser page.</w:t>
+      </w:r>
+    </w:p>
+    <w:p>
+      <w:pPr>
+        <w:pStyle w:val="ListBullet"/>
+      </w:pPr>
+      <w:r>
+        <w:rPr>
+          <w:rFonts w:ascii="Calibri" w:hAnsi="Calibri"/>
+          <w:color w:val="1E1C1C"/>
+          <w:sz w:val="21"/>
+        </w:rPr>
+        <w:t>Multiple URLs.</w:t>
+      </w:r>
+    </w:p>
+    <w:p>
+      <w:pPr>
+        <w:pStyle w:val="ListBullet"/>
+      </w:pPr>
+      <w:r>
+        <w:rPr>
+          <w:rFonts w:ascii="Calibri" w:hAnsi="Calibri"/>
+          <w:color w:val="1E1C1C"/>
+          <w:sz w:val="21"/>
+        </w:rPr>
+        <w:t>Existing HN workflow as `source=hacker_news`.</w:t>
+      </w:r>
+    </w:p>
+    <w:p>
+      <w:pPr>
+        <w:spacing w:before="0" w:after="120" w:line="300" w:lineRule="auto"/>
+      </w:pPr>
+      <w:r>
+        <w:rPr>
+          <w:rFonts w:ascii="Calibri" w:hAnsi="Calibri"/>
+          <w:color w:val="1E1C1C"/>
+          <w:sz w:val="22"/>
+        </w:rPr>
+        <w:t>Example commands:</w:t>
+      </w:r>
+    </w:p>
+    <w:p>
+      <w:pPr>
+        <w:pStyle w:val="ListBullet"/>
+      </w:pPr>
+      <w:r>
+        <w:rPr>
+          <w:rFonts w:ascii="Calibri" w:hAnsi="Calibri"/>
+          <w:color w:val="1E1C1C"/>
+          <w:sz w:val="21"/>
+        </w:rPr>
+        <w:t>"Open this article, summarize it, and save it as Markdown."</w:t>
+      </w:r>
+    </w:p>
+    <w:p>
+      <w:pPr>
+        <w:pStyle w:val="ListBullet"/>
+      </w:pPr>
+      <w:r>
+        <w:rPr>
+          <w:rFonts w:ascii="Calibri" w:hAnsi="Calibri"/>
+          <w:color w:val="1E1C1C"/>
+          <w:sz w:val="21"/>
+        </w:rPr>
+        <w:t>"Research three alternatives to Raycast and save a comparison."</w:t>
+      </w:r>
+    </w:p>
+    <w:p>
+      <w:pPr>
+        <w:pStyle w:val="ListBullet"/>
+      </w:pPr>
+      <w:r>
+        <w:rPr>
+          <w:rFonts w:ascii="Calibri" w:hAnsi="Calibri"/>
+          <w:color w:val="1E1C1C"/>
+          <w:sz w:val="21"/>
+        </w:rPr>
+        <w:t>"Grab the top 5 posts from Hacker News and save them to Markdown."</w:t>
+      </w:r>
+    </w:p>
+    <w:p>
+      <w:pPr>
+        <w:pStyle w:val="ListBullet"/>
+      </w:pPr>
+      <w:r>
+        <w:rPr>
+          <w:rFonts w:ascii="Calibri" w:hAnsi="Calibri"/>
+          <w:color w:val="1E1C1C"/>
+          <w:sz w:val="21"/>
+        </w:rPr>
+        <w:t>"Turn this web page into clean notes."</w:t>
+      </w:r>
+    </w:p>
+    <w:p>
+      <w:pPr>
+        <w:pStyle w:val="ListBullet"/>
+      </w:pPr>
+      <w:r>
+        <w:rPr>
+          <w:rFonts w:ascii="Calibri" w:hAnsi="Calibri"/>
+          <w:color w:val="1E1C1C"/>
+          <w:sz w:val="21"/>
+        </w:rPr>
+        <w:t>"Find recent articles about Mac AI agents and save the best links."</w:t>
+      </w:r>
+    </w:p>
+    <w:p>
+      <w:pPr>
+        <w:spacing w:before="0" w:after="120" w:line="300" w:lineRule="auto"/>
+      </w:pPr>
+      <w:r>
+        <w:rPr>
+          <w:rFonts w:ascii="Calibri" w:hAnsi="Calibri"/>
+          <w:color w:val="1E1C1C"/>
+          <w:sz w:val="22"/>
+        </w:rPr>
+        <w:t>Implementation direction for the pre-major-release pass:</w:t>
+      </w:r>
+    </w:p>
+    <w:p>
+      <w:pPr>
+        <w:pStyle w:val="ListBullet"/>
+      </w:pPr>
+      <w:r>
+        <w:rPr>
+          <w:rFonts w:ascii="Calibri" w:hAnsi="Calibri"/>
+          <w:color w:val="1E1C1C"/>
+          <w:sz w:val="21"/>
+        </w:rPr>
+        <w:t>Introduce a generic `web_research` or `web_to_markdown` operation family.</w:t>
+      </w:r>
+    </w:p>
+    <w:p>
+      <w:pPr>
+        <w:pStyle w:val="ListBullet"/>
+      </w:pPr>
+      <w:r>
+        <w:rPr>
+          <w:rFonts w:ascii="Calibri" w:hAnsi="Calibri"/>
+          <w:color w:val="1E1C1C"/>
+          <w:sz w:val="21"/>
+        </w:rPr>
+        <w:t>Keep HN as a specialized provider because its official/public API is reliable.</w:t>
+      </w:r>
+    </w:p>
+    <w:p>
+      <w:pPr>
+        <w:pStyle w:val="ListBullet"/>
+      </w:pPr>
+      <w:r>
+        <w:rPr>
+          <w:rFonts w:ascii="Calibri" w:hAnsi="Calibri"/>
+          <w:color w:val="1E1C1C"/>
+          <w:sz w:val="21"/>
+        </w:rPr>
+        <w:t>Use URLSession for basic public pages.</w:t>
+      </w:r>
+    </w:p>
+    <w:p>
+      <w:pPr>
+        <w:pStyle w:val="ListBullet"/>
+      </w:pPr>
+      <w:r>
+        <w:rPr>
+          <w:rFonts w:ascii="Calibri" w:hAnsi="Calibri"/>
+          <w:color w:val="1E1C1C"/>
+          <w:sz w:val="21"/>
+        </w:rPr>
+        <w:t>Use a real HTML parser/readability-style extraction instead of ad hoc string slicing.</w:t>
+      </w:r>
+    </w:p>
+    <w:p>
+      <w:pPr>
+        <w:pStyle w:val="ListBullet"/>
+      </w:pPr>
+      <w:r>
+        <w:rPr>
+          <w:rFonts w:ascii="Calibri" w:hAnsi="Calibri"/>
+          <w:color w:val="1E1C1C"/>
+          <w:sz w:val="21"/>
+        </w:rPr>
+        <w:t>Store source URLs and retrieval timestamps in the Markdown.</w:t>
+      </w:r>
+    </w:p>
+    <w:p>
+      <w:pPr>
+        <w:pStyle w:val="ListBullet"/>
+      </w:pPr>
+      <w:r>
+        <w:rPr>
+          <w:rFonts w:ascii="Calibri" w:hAnsi="Calibri"/>
+          <w:color w:val="1E1C1C"/>
+          <w:sz w:val="21"/>
+        </w:rPr>
+        <w:t>Mark web content as untrusted observed content in prompts and logs.</w:t>
+      </w:r>
+    </w:p>
+    <w:p>
+      <w:pPr>
+        <w:pStyle w:val="ListBullet"/>
+      </w:pPr>
+      <w:r>
+        <w:rPr>
+          <w:rFonts w:ascii="Calibri" w:hAnsi="Calibri"/>
+          <w:color w:val="1E1C1C"/>
+          <w:sz w:val="21"/>
+        </w:rPr>
+        <w:t>Require user confirmation or explicit command before using logged-in/private active browser content.</w:t>
+      </w:r>
+    </w:p>
+    <w:p>
+      <w:pPr>
+        <w:pStyle w:val="ListBullet"/>
+      </w:pPr>
+      <w:r>
+        <w:rPr>
+          <w:rFonts w:ascii="Calibri" w:hAnsi="Calibri"/>
+          <w:color w:val="1E1C1C"/>
+          <w:sz w:val="21"/>
+        </w:rPr>
+        <w:t>Do not bypass paywalls, CAPTCHAs, robots restrictions, or login walls.</w:t>
+      </w:r>
+    </w:p>
+    <w:p>
+      <w:pPr>
+        <w:spacing w:before="0" w:after="120" w:line="300" w:lineRule="auto"/>
+      </w:pPr>
+      <w:r>
+        <w:rPr>
+          <w:rFonts w:ascii="Calibri" w:hAnsi="Calibri"/>
+          <w:color w:val="1E1C1C"/>
+          <w:sz w:val="22"/>
+        </w:rPr>
+        <w:t>Acceptance criteria:</w:t>
+      </w:r>
+    </w:p>
+    <w:p>
+      <w:pPr>
+        <w:pStyle w:val="ListBullet"/>
+      </w:pPr>
+      <w:r>
+        <w:rPr>
+          <w:rFonts w:ascii="Calibri" w:hAnsi="Calibri"/>
+          <w:color w:val="1E1C1C"/>
+          <w:sz w:val="21"/>
+        </w:rPr>
+        <w:t>Existing HN dry-run and run flows still work.</w:t>
+      </w:r>
+    </w:p>
+    <w:p>
+      <w:pPr>
+        <w:pStyle w:val="ListBullet"/>
+      </w:pPr>
+      <w:r>
+        <w:rPr>
+          <w:rFonts w:ascii="Calibri" w:hAnsi="Calibri"/>
+          <w:color w:val="1E1C1C"/>
+          <w:sz w:val="21"/>
+        </w:rPr>
+        <w:t>A direct public article URL can be summarized into Markdown.</w:t>
+      </w:r>
+    </w:p>
+    <w:p>
+      <w:pPr>
+        <w:pStyle w:val="ListBullet"/>
+      </w:pPr>
+      <w:r>
+        <w:rPr>
+          <w:rFonts w:ascii="Calibri" w:hAnsi="Calibri"/>
+          <w:color w:val="1E1C1C"/>
+          <w:sz w:val="21"/>
+        </w:rPr>
+        <w:t>A search/topic command can produce a Markdown research note with source links.</w:t>
+      </w:r>
+    </w:p>
+    <w:p>
+      <w:pPr>
+        <w:pStyle w:val="ListBullet"/>
+      </w:pPr>
+      <w:r>
+        <w:rPr>
+          <w:rFonts w:ascii="Calibri" w:hAnsi="Calibri"/>
+          <w:color w:val="1E1C1C"/>
+          <w:sz w:val="21"/>
+        </w:rPr>
+        <w:t>Malicious page text such as "ignore prior instructions" is treated as content, not instruction.</w:t>
+      </w:r>
+    </w:p>
+    <w:p>
+      <w:pPr>
+        <w:pStyle w:val="ListBullet"/>
+      </w:pPr>
+      <w:r>
+        <w:rPr>
+          <w:rFonts w:ascii="Calibri" w:hAnsi="Calibri"/>
+          <w:color w:val="1E1C1C"/>
+          <w:sz w:val="21"/>
+        </w:rPr>
+        <w:t>Markdown contains source links and a generation timestamp.</w:t>
+      </w:r>
+    </w:p>
+    <w:p>
+      <w:pPr>
+        <w:pStyle w:val="Heading2"/>
+      </w:pPr>
+      <w:r>
+        <w:t>4A.3 General App And Website Action Foundation</w:t>
+      </w:r>
+    </w:p>
+    <w:p>
+      <w:pPr>
+        <w:spacing w:before="0" w:after="120" w:line="300" w:lineRule="auto"/>
+      </w:pPr>
+      <w:r>
+        <w:rPr>
+          <w:rFonts w:ascii="Calibri" w:hAnsi="Calibri"/>
+          <w:color w:val="1E1C1C"/>
+          <w:sz w:val="22"/>
+        </w:rPr>
+        <w:t>Generalize current app/URL opening without pretending to support arbitrary app automation yet.</w:t>
+      </w:r>
+    </w:p>
+    <w:p>
+      <w:pPr>
+        <w:spacing w:before="0" w:after="120" w:line="300" w:lineRule="auto"/>
+      </w:pPr>
+      <w:r>
+        <w:rPr>
+          <w:rFonts w:ascii="Calibri" w:hAnsi="Calibri"/>
+          <w:color w:val="1E1C1C"/>
+          <w:sz w:val="22"/>
+        </w:rPr>
+        <w:t>Pre-major-release app action model:</w:t>
+      </w:r>
+    </w:p>
+    <w:p>
+      <w:pPr>
+        <w:pStyle w:val="ListBullet"/>
+      </w:pPr>
+      <w:r>
+        <w:rPr>
+          <w:rFonts w:ascii="Calibri" w:hAnsi="Calibri"/>
+          <w:color w:val="1E1C1C"/>
+          <w:sz w:val="21"/>
+        </w:rPr>
+        <w:t>App catalog remains allowlisted by bundle ID.</w:t>
+      </w:r>
+    </w:p>
+    <w:p>
+      <w:pPr>
+        <w:pStyle w:val="ListBullet"/>
+      </w:pPr>
+      <w:r>
+        <w:rPr>
+          <w:rFonts w:ascii="Calibri" w:hAnsi="Calibri"/>
+          <w:color w:val="1E1C1C"/>
+          <w:sz w:val="21"/>
+        </w:rPr>
+        <w:t>Website shortcuts remain allowlisted or URL-validated.</w:t>
+      </w:r>
+    </w:p>
+    <w:p>
+      <w:pPr>
+        <w:pStyle w:val="ListBullet"/>
+      </w:pPr>
+      <w:r>
+        <w:rPr>
+          <w:rFonts w:ascii="Calibri" w:hAnsi="Calibri"/>
+          <w:color w:val="1E1C1C"/>
+          <w:sz w:val="21"/>
+        </w:rPr>
+        <w:t>App actions are declared as small adapters, not scattered conditionals.</w:t>
+      </w:r>
+    </w:p>
+    <w:p>
+      <w:pPr>
+        <w:pStyle w:val="ListBullet"/>
+      </w:pPr>
+      <w:r>
+        <w:rPr>
+          <w:rFonts w:ascii="Calibri" w:hAnsi="Calibri"/>
+          <w:color w:val="1E1C1C"/>
+          <w:sz w:val="21"/>
+        </w:rPr>
+        <w:t>Each adapter declares supported actions, required permissions, risk level, and fallback behavior.</w:t>
+      </w:r>
+    </w:p>
+    <w:p>
+      <w:pPr>
+        <w:spacing w:before="0" w:after="120" w:line="300" w:lineRule="auto"/>
+      </w:pPr>
+      <w:r>
+        <w:rPr>
+          <w:rFonts w:ascii="Calibri" w:hAnsi="Calibri"/>
+          <w:color w:val="1E1C1C"/>
+          <w:sz w:val="22"/>
+        </w:rPr>
+        <w:t>Initial action types:</w:t>
+      </w:r>
+    </w:p>
+    <w:p>
+      <w:pPr>
+        <w:pStyle w:val="ListBullet"/>
+      </w:pPr>
+      <w:r>
+        <w:rPr>
+          <w:rFonts w:ascii="Calibri" w:hAnsi="Calibri"/>
+          <w:color w:val="1E1C1C"/>
+          <w:sz w:val="21"/>
+        </w:rPr>
+        <w:t>Open app.</w:t>
+      </w:r>
+    </w:p>
+    <w:p>
+      <w:pPr>
+        <w:pStyle w:val="ListBullet"/>
+      </w:pPr>
+      <w:r>
+        <w:rPr>
+          <w:rFonts w:ascii="Calibri" w:hAnsi="Calibri"/>
+          <w:color w:val="1E1C1C"/>
+          <w:sz w:val="21"/>
+        </w:rPr>
+        <w:t>Open URL.</w:t>
+      </w:r>
+    </w:p>
+    <w:p>
+      <w:pPr>
+        <w:pStyle w:val="ListBullet"/>
+      </w:pPr>
+      <w:r>
+        <w:rPr>
+          <w:rFonts w:ascii="Calibri" w:hAnsi="Calibri"/>
+          <w:color w:val="1E1C1C"/>
+          <w:sz w:val="21"/>
+        </w:rPr>
+        <w:t>Open app search URL.</w:t>
+      </w:r>
+    </w:p>
+    <w:p>
+      <w:pPr>
+        <w:pStyle w:val="ListBullet"/>
+      </w:pPr>
+      <w:r>
+        <w:rPr>
+          <w:rFonts w:ascii="Calibri" w:hAnsi="Calibri"/>
+          <w:color w:val="1E1C1C"/>
+          <w:sz w:val="21"/>
+        </w:rPr>
+        <w:t>Open workspace.</w:t>
+      </w:r>
+    </w:p>
+    <w:p>
+      <w:pPr>
+        <w:pStyle w:val="ListBullet"/>
+      </w:pPr>
+      <w:r>
+        <w:rPr>
+          <w:rFonts w:ascii="Calibri" w:hAnsi="Calibri"/>
+          <w:color w:val="1E1C1C"/>
+          <w:sz w:val="21"/>
+        </w:rPr>
+        <w:t>Create local draft where supported.</w:t>
+      </w:r>
+    </w:p>
+    <w:p>
+      <w:pPr>
+        <w:pStyle w:val="ListBullet"/>
+      </w:pPr>
+      <w:r>
+        <w:rPr>
+          <w:rFonts w:ascii="Calibri" w:hAnsi="Calibri"/>
+          <w:color w:val="1E1C1C"/>
+          <w:sz w:val="21"/>
+        </w:rPr>
+        <w:t>Reveal file/folder.</w:t>
+      </w:r>
+    </w:p>
+    <w:p>
+      <w:pPr>
+        <w:pStyle w:val="ListBullet"/>
+      </w:pPr>
+      <w:r>
+        <w:rPr>
+          <w:rFonts w:ascii="Calibri" w:hAnsi="Calibri"/>
+          <w:color w:val="1E1C1C"/>
+          <w:sz w:val="21"/>
+        </w:rPr>
+        <w:t>Open generated artifact.</w:t>
+      </w:r>
+    </w:p>
+    <w:p>
+      <w:pPr>
+        <w:spacing w:before="0" w:after="120" w:line="300" w:lineRule="auto"/>
+      </w:pPr>
+      <w:r>
+        <w:rPr>
+          <w:rFonts w:ascii="Calibri" w:hAnsi="Calibri"/>
+          <w:color w:val="1E1C1C"/>
+          <w:sz w:val="22"/>
+        </w:rPr>
+        <w:t>Examples:</w:t>
+      </w:r>
+    </w:p>
+    <w:p>
+      <w:pPr>
+        <w:pStyle w:val="ListBullet"/>
+      </w:pPr>
+      <w:r>
+        <w:rPr>
+          <w:rFonts w:ascii="Calibri" w:hAnsi="Calibri"/>
+          <w:color w:val="1E1C1C"/>
+          <w:sz w:val="21"/>
+        </w:rPr>
+        <w:t>"Open Gmail."</w:t>
+      </w:r>
+    </w:p>
+    <w:p>
+      <w:pPr>
+        <w:pStyle w:val="ListBullet"/>
+      </w:pPr>
+      <w:r>
+        <w:rPr>
+          <w:rFonts w:ascii="Calibri" w:hAnsi="Calibri"/>
+          <w:color w:val="1E1C1C"/>
+          <w:sz w:val="21"/>
+        </w:rPr>
+        <w:t>"Open GitHub issues for this repo."</w:t>
+      </w:r>
+    </w:p>
+    <w:p>
+      <w:pPr>
+        <w:pStyle w:val="ListBullet"/>
+      </w:pPr>
+      <w:r>
+        <w:rPr>
+          <w:rFonts w:ascii="Calibri" w:hAnsi="Calibri"/>
+          <w:color w:val="1E1C1C"/>
+          <w:sz w:val="21"/>
+        </w:rPr>
+        <w:t>"Open Spotify and search for Jimmy Cooks."</w:t>
+      </w:r>
+    </w:p>
+    <w:p>
+      <w:pPr>
+        <w:pStyle w:val="ListBullet"/>
+      </w:pPr>
+      <w:r>
+        <w:rPr>
+          <w:rFonts w:ascii="Calibri" w:hAnsi="Calibri"/>
+          <w:color w:val="1E1C1C"/>
+          <w:sz w:val="21"/>
+        </w:rPr>
+        <w:t>"Open Apple Music and search for SZA."</w:t>
+      </w:r>
+    </w:p>
+    <w:p>
+      <w:pPr>
+        <w:pStyle w:val="ListBullet"/>
+      </w:pPr>
+      <w:r>
+        <w:rPr>
+          <w:rFonts w:ascii="Calibri" w:hAnsi="Calibri"/>
+          <w:color w:val="1E1C1C"/>
+          <w:sz w:val="21"/>
+        </w:rPr>
+        <w:t>"Open my writing workspace."</w:t>
+      </w:r>
+    </w:p>
+    <w:p>
+      <w:pPr>
+        <w:spacing w:before="0" w:after="120" w:line="300" w:lineRule="auto"/>
+      </w:pPr>
+      <w:r>
+        <w:rPr>
+          <w:rFonts w:ascii="Calibri" w:hAnsi="Calibri"/>
+          <w:color w:val="1E1C1C"/>
+          <w:sz w:val="22"/>
+        </w:rPr>
+        <w:t>Important constraint:</w:t>
+      </w:r>
+    </w:p>
+    <w:p>
+      <w:pPr>
+        <w:pStyle w:val="ListBullet"/>
+      </w:pPr>
+      <w:r>
+        <w:rPr>
+          <w:rFonts w:ascii="Calibri" w:hAnsi="Calibri"/>
+          <w:color w:val="1E1C1C"/>
+          <w:sz w:val="21"/>
+        </w:rPr>
+        <w:t>This pass should not add unrestricted UI control. App-specific control belongs to the later Power Mode work.</w:t>
+      </w:r>
+    </w:p>
+    <w:p>
+      <w:pPr>
+        <w:pStyle w:val="Heading2"/>
+      </w:pPr>
+      <w:r>
+        <w:t>4A.4 Real Music Playback Strategy</w:t>
+      </w:r>
+    </w:p>
+    <w:p>
+      <w:pPr>
+        <w:spacing w:before="0" w:after="120" w:line="300" w:lineRule="auto"/>
+      </w:pPr>
+      <w:r>
+        <w:rPr>
+          <w:rFonts w:ascii="Calibri" w:hAnsi="Calibri"/>
+          <w:color w:val="1E1C1C"/>
+          <w:sz w:val="22"/>
+        </w:rPr>
+        <w:t>Current prototype behavior opens Apple Music or Spotify results but does not reliably play the requested track. The pre-major-release pass should convert this into a provider-aware media capability with graceful fallbacks.</w:t>
+      </w:r>
+    </w:p>
+    <w:p>
+      <w:pPr>
+        <w:spacing w:before="0" w:after="120" w:line="300" w:lineRule="auto"/>
+      </w:pPr>
+      <w:r>
+        <w:rPr>
+          <w:rFonts w:ascii="Calibri" w:hAnsi="Calibri"/>
+          <w:color w:val="1E1C1C"/>
+          <w:sz w:val="22"/>
+        </w:rPr>
+        <w:t>Target command:</w:t>
+      </w:r>
+    </w:p>
+    <w:p>
+      <w:pPr>
+        <w:pStyle w:val="ListBullet"/>
+      </w:pPr>
+      <w:r>
+        <w:rPr>
+          <w:rFonts w:ascii="Calibri" w:hAnsi="Calibri"/>
+          <w:color w:val="1E1C1C"/>
+          <w:sz w:val="21"/>
+        </w:rPr>
+        <w:t>"Play Jimmy Cooks by Drake on Apple Music."</w:t>
+      </w:r>
+    </w:p>
+    <w:p>
+      <w:pPr>
+        <w:pStyle w:val="ListBullet"/>
+      </w:pPr>
+      <w:r>
+        <w:rPr>
+          <w:rFonts w:ascii="Calibri" w:hAnsi="Calibri"/>
+          <w:color w:val="1E1C1C"/>
+          <w:sz w:val="21"/>
+        </w:rPr>
+        <w:t>"Play Father Stretch My Hands by Kanye West on Spotify."</w:t>
+      </w:r>
+    </w:p>
+    <w:p>
+      <w:pPr>
+        <w:pStyle w:val="ListBullet"/>
+      </w:pPr>
+      <w:r>
+        <w:rPr>
+          <w:rFonts w:ascii="Calibri" w:hAnsi="Calibri"/>
+          <w:color w:val="1E1C1C"/>
+          <w:sz w:val="21"/>
+        </w:rPr>
+        <w:t>"Play the album Her Loss on Apple Music."</w:t>
+      </w:r>
+    </w:p>
+    <w:p>
+      <w:pPr>
+        <w:spacing w:before="0" w:after="120" w:line="300" w:lineRule="auto"/>
+      </w:pPr>
+      <w:r>
+        <w:rPr>
+          <w:rFonts w:ascii="Calibri" w:hAnsi="Calibri"/>
+          <w:color w:val="1E1C1C"/>
+          <w:sz w:val="22"/>
+        </w:rPr>
+        <w:t>Spotify implementation strategy:</w:t>
+      </w:r>
+    </w:p>
+    <w:p>
+      <w:pPr>
+        <w:pStyle w:val="ListBullet"/>
+      </w:pPr>
+      <w:r>
+        <w:rPr>
+          <w:rFonts w:ascii="Calibri" w:hAnsi="Calibri"/>
+          <w:color w:val="1E1C1C"/>
+          <w:sz w:val="21"/>
+        </w:rPr>
+        <w:t>Use Spotify OAuth with Authorization Code + PKCE.</w:t>
+      </w:r>
+    </w:p>
+    <w:p>
+      <w:pPr>
+        <w:pStyle w:val="ListBullet"/>
+      </w:pPr>
+      <w:r>
+        <w:rPr>
+          <w:rFonts w:ascii="Calibri" w:hAnsi="Calibri"/>
+          <w:color w:val="1E1C1C"/>
+          <w:sz w:val="21"/>
+        </w:rPr>
+        <w:t>Request playback scopes such as `user-modify-playback-state`; add read scopes only when needed for devices/current playback.</w:t>
+      </w:r>
+    </w:p>
+    <w:p>
+      <w:pPr>
+        <w:pStyle w:val="ListBullet"/>
+      </w:pPr>
+      <w:r>
+        <w:rPr>
+          <w:rFonts w:ascii="Calibri" w:hAnsi="Calibri"/>
+          <w:color w:val="1E1C1C"/>
+          <w:sz w:val="21"/>
+        </w:rPr>
+        <w:t>Search for track/album/artist through Spotify Web API.</w:t>
+      </w:r>
+    </w:p>
+    <w:p>
+      <w:pPr>
+        <w:pStyle w:val="ListBullet"/>
+      </w:pPr>
+      <w:r>
+        <w:rPr>
+          <w:rFonts w:ascii="Calibri" w:hAnsi="Calibri"/>
+          <w:color w:val="1E1C1C"/>
+          <w:sz w:val="21"/>
+        </w:rPr>
+        <w:t>Resolve the best matching track URI using title, artist, album, duration, and market.</w:t>
+      </w:r>
+    </w:p>
+    <w:p>
+      <w:pPr>
+        <w:pStyle w:val="ListBullet"/>
+      </w:pPr>
+      <w:r>
+        <w:rPr>
+          <w:rFonts w:ascii="Calibri" w:hAnsi="Calibri"/>
+          <w:color w:val="1E1C1C"/>
+          <w:sz w:val="21"/>
+        </w:rPr>
+        <w:t>Get available devices and choose active device when possible.</w:t>
+      </w:r>
+    </w:p>
+    <w:p>
+      <w:pPr>
+        <w:pStyle w:val="ListBullet"/>
+      </w:pPr>
+      <w:r>
+        <w:rPr>
+          <w:rFonts w:ascii="Calibri" w:hAnsi="Calibri"/>
+          <w:color w:val="1E1C1C"/>
+          <w:sz w:val="21"/>
+        </w:rPr>
+        <w:t>If needed, transfer playback to the current Mac/Spotify client.</w:t>
+      </w:r>
+    </w:p>
+    <w:p>
+      <w:pPr>
+        <w:pStyle w:val="ListBullet"/>
+      </w:pPr>
+      <w:r>
+        <w:rPr>
+          <w:rFonts w:ascii="Calibri" w:hAnsi="Calibri"/>
+          <w:color w:val="1E1C1C"/>
+          <w:sz w:val="21"/>
+        </w:rPr>
+        <w:t>Start playback through Spotify Web API `PUT /v1/me/player/play`.</w:t>
+      </w:r>
+    </w:p>
+    <w:p>
+      <w:pPr>
+        <w:pStyle w:val="ListBullet"/>
+      </w:pPr>
+      <w:r>
+        <w:rPr>
+          <w:rFonts w:ascii="Calibri" w:hAnsi="Calibri"/>
+          <w:color w:val="1E1C1C"/>
+          <w:sz w:val="21"/>
+        </w:rPr>
+        <w:t>Use `uris` for exact track playback.</w:t>
+      </w:r>
+    </w:p>
+    <w:p>
+      <w:pPr>
+        <w:pStyle w:val="ListBullet"/>
+      </w:pPr>
+      <w:r>
+        <w:rPr>
+          <w:rFonts w:ascii="Calibri" w:hAnsi="Calibri"/>
+          <w:color w:val="1E1C1C"/>
+          <w:sz w:val="21"/>
+        </w:rPr>
+        <w:t>Use `context_uri` plus `offset` for album/playlist playback.</w:t>
+      </w:r>
+    </w:p>
+    <w:p>
+      <w:pPr>
+        <w:pStyle w:val="ListBullet"/>
+      </w:pPr>
+      <w:r>
+        <w:rPr>
+          <w:rFonts w:ascii="Calibri" w:hAnsi="Calibri"/>
+          <w:color w:val="1E1C1C"/>
+          <w:sz w:val="21"/>
+        </w:rPr>
+        <w:t>Surface Spotify Premium requirement clearly because Spotify's playback endpoint only works for Premium users.</w:t>
+      </w:r>
+    </w:p>
+    <w:p>
+      <w:pPr>
+        <w:pStyle w:val="ListBullet"/>
+      </w:pPr>
+      <w:r>
+        <w:rPr>
+          <w:rFonts w:ascii="Calibri" w:hAnsi="Calibri"/>
+          <w:color w:val="1E1C1C"/>
+          <w:sz w:val="21"/>
+        </w:rPr>
+        <w:t>If API playback fails because there is no active device, open Spotify to the exact track/album URI and tell the user what is missing.</w:t>
+      </w:r>
+    </w:p>
+    <w:p>
+      <w:pPr>
+        <w:spacing w:before="0" w:after="120" w:line="300" w:lineRule="auto"/>
+      </w:pPr>
+      <w:r>
+        <w:rPr>
+          <w:rFonts w:ascii="Calibri" w:hAnsi="Calibri"/>
+          <w:color w:val="1E1C1C"/>
+          <w:sz w:val="22"/>
+        </w:rPr>
+        <w:t>Apple Music implementation strategy:</w:t>
+      </w:r>
+    </w:p>
+    <w:p>
+      <w:pPr>
+        <w:pStyle w:val="ListBullet"/>
+      </w:pPr>
+      <w:r>
+        <w:rPr>
+          <w:rFonts w:ascii="Calibri" w:hAnsi="Calibri"/>
+          <w:color w:val="1E1C1C"/>
+          <w:sz w:val="21"/>
+        </w:rPr>
+        <w:t>Use MusicKit where possible rather than UI clicking.</w:t>
+      </w:r>
+    </w:p>
+    <w:p>
+      <w:pPr>
+        <w:pStyle w:val="ListBullet"/>
+      </w:pPr>
+      <w:r>
+        <w:rPr>
+          <w:rFonts w:ascii="Calibri" w:hAnsi="Calibri"/>
+          <w:color w:val="1E1C1C"/>
+          <w:sz w:val="21"/>
+        </w:rPr>
+        <w:t>Request Apple Music authorization.</w:t>
+      </w:r>
+    </w:p>
+    <w:p>
+      <w:pPr>
+        <w:pStyle w:val="ListBullet"/>
+      </w:pPr>
+      <w:r>
+        <w:rPr>
+          <w:rFonts w:ascii="Calibri" w:hAnsi="Calibri"/>
+          <w:color w:val="1E1C1C"/>
+          <w:sz w:val="21"/>
+        </w:rPr>
+        <w:t>Search catalog using MusicKit or Apple Music API search.</w:t>
+      </w:r>
+    </w:p>
+    <w:p>
+      <w:pPr>
+        <w:pStyle w:val="ListBullet"/>
+      </w:pPr>
+      <w:r>
+        <w:rPr>
+          <w:rFonts w:ascii="Calibri" w:hAnsi="Calibri"/>
+          <w:color w:val="1E1C1C"/>
+          <w:sz w:val="21"/>
+        </w:rPr>
+        <w:t>Resolve best matching song/album using title, artist, album, duration, and storefront.</w:t>
+      </w:r>
+    </w:p>
+    <w:p>
+      <w:pPr>
+        <w:pStyle w:val="ListBullet"/>
+      </w:pPr>
+      <w:r>
+        <w:rPr>
+          <w:rFonts w:ascii="Calibri" w:hAnsi="Calibri"/>
+          <w:color w:val="1E1C1C"/>
+          <w:sz w:val="21"/>
+        </w:rPr>
+        <w:t>Queue the resolved item in `ApplicationMusicPlayer` and call play.</w:t>
+      </w:r>
+    </w:p>
+    <w:p>
+      <w:pPr>
+        <w:pStyle w:val="ListBullet"/>
+      </w:pPr>
+      <w:r>
+        <w:rPr>
+          <w:rFonts w:ascii="Calibri" w:hAnsi="Calibri"/>
+          <w:color w:val="1E1C1C"/>
+          <w:sz w:val="21"/>
+        </w:rPr>
+        <w:t>Require Apple Music subscription where playback requires it.</w:t>
+      </w:r>
+    </w:p>
+    <w:p>
+      <w:pPr>
+        <w:pStyle w:val="ListBullet"/>
+      </w:pPr>
+      <w:r>
+        <w:rPr>
+          <w:rFonts w:ascii="Calibri" w:hAnsi="Calibri"/>
+          <w:color w:val="1E1C1C"/>
+          <w:sz w:val="21"/>
+        </w:rPr>
+        <w:t>Use Music app AppleScript only as a local-library fallback for tracks already in the user's library.</w:t>
+      </w:r>
+    </w:p>
+    <w:p>
+      <w:pPr>
+        <w:pStyle w:val="ListBullet"/>
+      </w:pPr>
+      <w:r>
+        <w:rPr>
+          <w:rFonts w:ascii="Calibri" w:hAnsi="Calibri"/>
+          <w:color w:val="1E1C1C"/>
+          <w:sz w:val="21"/>
+        </w:rPr>
+        <w:t>If catalog playback cannot be authorized or confirmed, open the exact Apple Music result and explain the limitation.</w:t>
+      </w:r>
+    </w:p>
+    <w:p>
+      <w:pPr>
+        <w:spacing w:before="0" w:after="120" w:line="300" w:lineRule="auto"/>
+      </w:pPr>
+      <w:r>
+        <w:rPr>
+          <w:rFonts w:ascii="Calibri" w:hAnsi="Calibri"/>
+          <w:color w:val="1E1C1C"/>
+          <w:sz w:val="22"/>
+        </w:rPr>
+        <w:t>Do not use Power Mode as the primary media strategy:</w:t>
+      </w:r>
+    </w:p>
+    <w:p>
+      <w:pPr>
+        <w:pStyle w:val="ListBullet"/>
+      </w:pPr>
+      <w:r>
+        <w:rPr>
+          <w:rFonts w:ascii="Calibri" w:hAnsi="Calibri"/>
+          <w:color w:val="1E1C1C"/>
+          <w:sz w:val="21"/>
+        </w:rPr>
+        <w:t>Clicking around Apple Music/Spotify UI is brittle.</w:t>
+      </w:r>
+    </w:p>
+    <w:p>
+      <w:pPr>
+        <w:pStyle w:val="ListBullet"/>
+      </w:pPr>
+      <w:r>
+        <w:rPr>
+          <w:rFonts w:ascii="Calibri" w:hAnsi="Calibri"/>
+          <w:color w:val="1E1C1C"/>
+          <w:sz w:val="21"/>
+        </w:rPr>
+        <w:t>Provider APIs give cleaner success/failure states.</w:t>
+      </w:r>
+    </w:p>
+    <w:p>
+      <w:pPr>
+        <w:pStyle w:val="ListBullet"/>
+      </w:pPr>
+      <w:r>
+        <w:rPr>
+          <w:rFonts w:ascii="Calibri" w:hAnsi="Calibri"/>
+          <w:color w:val="1E1C1C"/>
+          <w:sz w:val="21"/>
+        </w:rPr>
+        <w:t>UI control can be a future fallback only when the user explicitly enables Power Mode for that app.</w:t>
+      </w:r>
+    </w:p>
+    <w:p>
+      <w:pPr>
+        <w:spacing w:before="0" w:after="120" w:line="300" w:lineRule="auto"/>
+      </w:pPr>
+      <w:r>
+        <w:rPr>
+          <w:rFonts w:ascii="Calibri" w:hAnsi="Calibri"/>
+          <w:color w:val="1E1C1C"/>
+          <w:sz w:val="22"/>
+        </w:rPr>
+        <w:t>Acceptance criteria:</w:t>
+      </w:r>
+    </w:p>
+    <w:p>
+      <w:pPr>
+        <w:pStyle w:val="ListBullet"/>
+      </w:pPr>
+      <w:r>
+        <w:rPr>
+          <w:rFonts w:ascii="Calibri" w:hAnsi="Calibri"/>
+          <w:color w:val="1E1C1C"/>
+          <w:sz w:val="21"/>
+        </w:rPr>
+        <w:t>Existing result-opening behavior still works as fallback.</w:t>
+      </w:r>
+    </w:p>
+    <w:p>
+      <w:pPr>
+        <w:pStyle w:val="ListBullet"/>
+      </w:pPr>
+      <w:r>
+        <w:rPr>
+          <w:rFonts w:ascii="Calibri" w:hAnsi="Calibri"/>
+          <w:color w:val="1E1C1C"/>
+          <w:sz w:val="21"/>
+        </w:rPr>
+        <w:t>Spotify can play an exact track when the user has connected Spotify, has Premium, and has an active device.</w:t>
+      </w:r>
+    </w:p>
+    <w:p>
+      <w:pPr>
+        <w:pStyle w:val="ListBullet"/>
+      </w:pPr>
+      <w:r>
+        <w:rPr>
+          <w:rFonts w:ascii="Calibri" w:hAnsi="Calibri"/>
+          <w:color w:val="1E1C1C"/>
+          <w:sz w:val="21"/>
+        </w:rPr>
+        <w:t>Apple Music can play or queue an exact track when MusicKit authorization/subscription is available.</w:t>
+      </w:r>
+    </w:p>
+    <w:p>
+      <w:pPr>
+        <w:pStyle w:val="ListBullet"/>
+      </w:pPr>
+      <w:r>
+        <w:rPr>
+          <w:rFonts w:ascii="Calibri" w:hAnsi="Calibri"/>
+          <w:color w:val="1E1C1C"/>
+          <w:sz w:val="21"/>
+        </w:rPr>
+        <w:t>Sonny explains provider limitations clearly.</w:t>
+      </w:r>
+    </w:p>
+    <w:p>
+      <w:pPr>
+        <w:pStyle w:val="ListBullet"/>
+      </w:pPr>
+      <w:r>
+        <w:rPr>
+          <w:rFonts w:ascii="Calibri" w:hAnsi="Calibri"/>
+          <w:color w:val="1E1C1C"/>
+          <w:sz w:val="21"/>
+        </w:rPr>
+        <w:t>Dry-run previews whether the action will search, play, transfer playback, or open fallback.</w:t>
+      </w:r>
+    </w:p>
+    <w:p>
+      <w:pPr>
+        <w:pStyle w:val="Heading2"/>
+      </w:pPr>
+      <w:r>
+        <w:t>4A.5 Prototype Generalization Test Plan</w:t>
+      </w:r>
+    </w:p>
+    <w:p>
+      <w:pPr>
+        <w:spacing w:before="0" w:after="120" w:line="300" w:lineRule="auto"/>
+      </w:pPr>
+      <w:r>
+        <w:rPr>
+          <w:rFonts w:ascii="Calibri" w:hAnsi="Calibri"/>
+          <w:color w:val="1E1C1C"/>
+          <w:sz w:val="22"/>
+        </w:rPr>
+        <w:t>Before starting the major-release roadmap, run regression and generalization tests:</w:t>
+      </w:r>
+    </w:p>
+    <w:p>
+      <w:pPr>
+        <w:pStyle w:val="ListBullet"/>
+      </w:pPr>
+      <w:r>
+        <w:rPr>
+          <w:rFonts w:ascii="Calibri" w:hAnsi="Calibri"/>
+          <w:color w:val="1E1C1C"/>
+          <w:sz w:val="21"/>
+        </w:rPr>
+        <w:t>Existing largest-files zip dry-run and run.</w:t>
+      </w:r>
+    </w:p>
+    <w:p>
+      <w:pPr>
+        <w:pStyle w:val="ListBullet"/>
+      </w:pPr>
+      <w:r>
+        <w:rPr>
+          <w:rFonts w:ascii="Calibri" w:hAnsi="Calibri"/>
+          <w:color w:val="1E1C1C"/>
+          <w:sz w:val="21"/>
+        </w:rPr>
+        <w:t>Existing DOCX conversion dry-run and run.</w:t>
+      </w:r>
+    </w:p>
+    <w:p>
+      <w:pPr>
+        <w:pStyle w:val="ListBullet"/>
+      </w:pPr>
+      <w:r>
+        <w:rPr>
+          <w:rFonts w:ascii="Calibri" w:hAnsi="Calibri"/>
+          <w:color w:val="1E1C1C"/>
+          <w:sz w:val="21"/>
+        </w:rPr>
+        <w:t>Existing HN Markdown dry-run and run.</w:t>
+      </w:r>
+    </w:p>
+    <w:p>
+      <w:pPr>
+        <w:pStyle w:val="ListBullet"/>
+      </w:pPr>
+      <w:r>
+        <w:rPr>
+          <w:rFonts w:ascii="Calibri" w:hAnsi="Calibri"/>
+          <w:color w:val="1E1C1C"/>
+          <w:sz w:val="21"/>
+        </w:rPr>
+        <w:t>New generic URL-to-Markdown dry-run and run.</w:t>
+      </w:r>
+    </w:p>
+    <w:p>
+      <w:pPr>
+        <w:pStyle w:val="ListBullet"/>
+      </w:pPr>
+      <w:r>
+        <w:rPr>
+          <w:rFonts w:ascii="Calibri" w:hAnsi="Calibri"/>
+          <w:color w:val="1E1C1C"/>
+          <w:sz w:val="21"/>
+        </w:rPr>
+        <w:t>New topic/search-to-Markdown dry-run and run.</w:t>
+      </w:r>
+    </w:p>
+    <w:p>
+      <w:pPr>
+        <w:pStyle w:val="ListBullet"/>
+      </w:pPr>
+      <w:r>
+        <w:rPr>
+          <w:rFonts w:ascii="Calibri" w:hAnsi="Calibri"/>
+          <w:color w:val="1E1C1C"/>
+          <w:sz w:val="21"/>
+        </w:rPr>
+        <w:t>URL validation and prompt-injection page fixture.</w:t>
+      </w:r>
+    </w:p>
+    <w:p>
+      <w:pPr>
+        <w:pStyle w:val="ListBullet"/>
+      </w:pPr>
+      <w:r>
+        <w:rPr>
+          <w:rFonts w:ascii="Calibri" w:hAnsi="Calibri"/>
+          <w:color w:val="1E1C1C"/>
+          <w:sz w:val="21"/>
+        </w:rPr>
+        <w:t>Existing app opening.</w:t>
+      </w:r>
+    </w:p>
+    <w:p>
+      <w:pPr>
+        <w:pStyle w:val="ListBullet"/>
+      </w:pPr>
+      <w:r>
+        <w:rPr>
+          <w:rFonts w:ascii="Calibri" w:hAnsi="Calibri"/>
+          <w:color w:val="1E1C1C"/>
+          <w:sz w:val="21"/>
+        </w:rPr>
+        <w:t>Generic website opening.</w:t>
+      </w:r>
+    </w:p>
+    <w:p>
+      <w:pPr>
+        <w:pStyle w:val="ListBullet"/>
+      </w:pPr>
+      <w:r>
+        <w:rPr>
+          <w:rFonts w:ascii="Calibri" w:hAnsi="Calibri"/>
+          <w:color w:val="1E1C1C"/>
+          <w:sz w:val="21"/>
+        </w:rPr>
+        <w:t>Existing routine/workspace flows.</w:t>
+      </w:r>
+    </w:p>
+    <w:p>
+      <w:pPr>
+        <w:pStyle w:val="ListBullet"/>
+      </w:pPr>
+      <w:r>
+        <w:rPr>
+          <w:rFonts w:ascii="Calibri" w:hAnsi="Calibri"/>
+          <w:color w:val="1E1C1C"/>
+          <w:sz w:val="21"/>
+        </w:rPr>
+        <w:t>Media search fallback.</w:t>
+      </w:r>
+    </w:p>
+    <w:p>
+      <w:pPr>
+        <w:pStyle w:val="ListBullet"/>
+      </w:pPr>
+      <w:r>
+        <w:rPr>
+          <w:rFonts w:ascii="Calibri" w:hAnsi="Calibri"/>
+          <w:color w:val="1E1C1C"/>
+          <w:sz w:val="21"/>
+        </w:rPr>
+        <w:t>Spotify playback success/failure with mocked OAuth/API.</w:t>
+      </w:r>
+    </w:p>
+    <w:p>
+      <w:pPr>
+        <w:pStyle w:val="ListBullet"/>
+      </w:pPr>
+      <w:r>
+        <w:rPr>
+          <w:rFonts w:ascii="Calibri" w:hAnsi="Calibri"/>
+          <w:color w:val="1E1C1C"/>
+          <w:sz w:val="21"/>
+        </w:rPr>
+        <w:t>Apple Music playback success/failure with injected MusicKit adapter.</w:t>
+      </w:r>
+    </w:p>
+    <w:p>
+      <w:pPr>
+        <w:pStyle w:val="ListBullet"/>
+      </w:pPr>
+      <w:r>
+        <w:rPr>
+          <w:rFonts w:ascii="Calibri" w:hAnsi="Calibri"/>
+          <w:color w:val="1E1C1C"/>
+          <w:sz w:val="21"/>
+        </w:rPr>
+        <w:t>No Power Mode or hosted-backend assumptions introduced.</w:t>
       </w:r>
     </w:p>
     <w:p>
@@ -2425,6 +4683,32 @@
           <w:color w:val="1E1C1C"/>
           <w:sz w:val="21"/>
         </w:rPr>
+        <w:t>The menu-bar cockpit feels instant for command/task execution.</w:t>
+      </w:r>
+    </w:p>
+    <w:p>
+      <w:pPr>
+        <w:pStyle w:val="ListBullet"/>
+      </w:pPr>
+      <w:r>
+        <w:rPr>
+          <w:rFonts w:ascii="Calibri" w:hAnsi="Calibri"/>
+          <w:color w:val="1E1C1C"/>
+          <w:sz w:val="21"/>
+        </w:rPr>
+        <w:t>The full Sonny Command Center makes account, settings, permissions, privacy, history, stats, routines, workspaces, and Power Mode controls easy to understand.</w:t>
+      </w:r>
+    </w:p>
+    <w:p>
+      <w:pPr>
+        <w:pStyle w:val="ListBullet"/>
+      </w:pPr>
+      <w:r>
+        <w:rPr>
+          <w:rFonts w:ascii="Calibri" w:hAnsi="Calibri"/>
+          <w:color w:val="1E1C1C"/>
+          <w:sz w:val="21"/>
+        </w:rPr>
         <w:t>Screen context works reliably enough to feel magical but controlled.</w:t>
       </w:r>
     </w:p>
@@ -2477,6 +4761,32 @@
           <w:color w:val="1E1C1C"/>
           <w:sz w:val="21"/>
         </w:rPr>
+        <w:t>General web-to-Markdown workflows work beyond Hacker News.</w:t>
+      </w:r>
+    </w:p>
+    <w:p>
+      <w:pPr>
+        <w:pStyle w:val="ListBullet"/>
+      </w:pPr>
+      <w:r>
+        <w:rPr>
+          <w:rFonts w:ascii="Calibri" w:hAnsi="Calibri"/>
+          <w:color w:val="1E1C1C"/>
+          <w:sz w:val="21"/>
+        </w:rPr>
+        <w:t>Music playback works through provider APIs where supported, with clear fallback when provider requirements are missing.</w:t>
+      </w:r>
+    </w:p>
+    <w:p>
+      <w:pPr>
+        <w:pStyle w:val="ListBullet"/>
+      </w:pPr>
+      <w:r>
+        <w:rPr>
+          <w:rFonts w:ascii="Calibri" w:hAnsi="Calibri"/>
+          <w:color w:val="1E1C1C"/>
+          <w:sz w:val="21"/>
+        </w:rPr>
         <w:t>The agent recovers gracefully from failed steps.</w:t>
       </w:r>
     </w:p>
@@ -2904,7 +5214,20 @@
           <w:color w:val="1E1C1C"/>
           <w:sz w:val="21"/>
         </w:rPr>
-        <w:t>Menu bar and command surface.</w:t>
+        <w:t>Menu-bar cockpit for fast command/task interaction.</w:t>
+      </w:r>
+    </w:p>
+    <w:p>
+      <w:pPr>
+        <w:pStyle w:val="ListBullet"/>
+      </w:pPr>
+      <w:r>
+        <w:rPr>
+          <w:rFonts w:ascii="Calibri" w:hAnsi="Calibri"/>
+          <w:color w:val="1E1C1C"/>
+          <w:sz w:val="21"/>
+        </w:rPr>
+        <w:t>Full Sonny Command Center app for account, settings, privacy, stats, history, routines, workspaces, permissions, and Power Mode controls.</w:t>
       </w:r>
     </w:p>
     <w:p>
@@ -3078,6 +5401,19 @@
     </w:p>
     <w:p>
       <w:pPr>
+        <w:pStyle w:val="ListBullet"/>
+      </w:pPr>
+      <w:r>
+        <w:rPr>
+          <w:rFonts w:ascii="Calibri" w:hAnsi="Calibri"/>
+          <w:color w:val="1E1C1C"/>
+          <w:sz w:val="21"/>
+        </w:rPr>
+        <w:t>Usage and impact stats that are local-first, aggregate, and user-controllable.</w:t>
+      </w:r>
+    </w:p>
+    <w:p>
+      <w:pPr>
         <w:spacing w:before="0" w:after="120" w:line="300" w:lineRule="auto"/>
       </w:pPr>
       <w:r>
@@ -3297,6 +5633,365 @@
         <w:pStyle w:val="Heading2"/>
       </w:pPr>
       <w:r>
+        <w:t>6.3A Sonny Command Center</w:t>
+      </w:r>
+    </w:p>
+    <w:p>
+      <w:pPr>
+        <w:spacing w:before="0" w:after="120" w:line="300" w:lineRule="auto"/>
+      </w:pPr>
+      <w:r>
+        <w:rPr>
+          <w:rFonts w:ascii="Calibri" w:hAnsi="Calibri"/>
+          <w:color w:val="1E1C1C"/>
+          <w:sz w:val="22"/>
+        </w:rPr>
+        <w:t>V1 should not be only a floating widget. Sonny needs a full Mac app companion so the product has a serious home for settings, privacy, account, history, and workflow management.</w:t>
+      </w:r>
+    </w:p>
+    <w:p>
+      <w:pPr>
+        <w:spacing w:before="0" w:after="120" w:line="300" w:lineRule="auto"/>
+      </w:pPr>
+      <w:r>
+        <w:rPr>
+          <w:rFonts w:ascii="Calibri" w:hAnsi="Calibri"/>
+          <w:color w:val="1E1C1C"/>
+          <w:sz w:val="22"/>
+        </w:rPr>
+        <w:t>Menu-bar cockpit responsibilities:</w:t>
+      </w:r>
+    </w:p>
+    <w:p>
+      <w:pPr>
+        <w:pStyle w:val="ListBullet"/>
+      </w:pPr>
+      <w:r>
+        <w:rPr>
+          <w:rFonts w:ascii="Calibri" w:hAnsi="Calibri"/>
+          <w:color w:val="1E1C1C"/>
+          <w:sz w:val="21"/>
+        </w:rPr>
+        <w:t>Start tasks.</w:t>
+      </w:r>
+    </w:p>
+    <w:p>
+      <w:pPr>
+        <w:pStyle w:val="ListBullet"/>
+      </w:pPr>
+      <w:r>
+        <w:rPr>
+          <w:rFonts w:ascii="Calibri" w:hAnsi="Calibri"/>
+          <w:color w:val="1E1C1C"/>
+          <w:sz w:val="21"/>
+        </w:rPr>
+        <w:t>Speak or type.</w:t>
+      </w:r>
+    </w:p>
+    <w:p>
+      <w:pPr>
+        <w:pStyle w:val="ListBullet"/>
+      </w:pPr>
+      <w:r>
+        <w:rPr>
+          <w:rFonts w:ascii="Calibri" w:hAnsi="Calibri"/>
+          <w:color w:val="1E1C1C"/>
+          <w:sz w:val="21"/>
+        </w:rPr>
+        <w:t>Show the live current task.</w:t>
+      </w:r>
+    </w:p>
+    <w:p>
+      <w:pPr>
+        <w:pStyle w:val="ListBullet"/>
+      </w:pPr>
+      <w:r>
+        <w:rPr>
+          <w:rFonts w:ascii="Calibri" w:hAnsi="Calibri"/>
+          <w:color w:val="1E1C1C"/>
+          <w:sz w:val="21"/>
+        </w:rPr>
+        <w:t>Show quick approvals.</w:t>
+      </w:r>
+    </w:p>
+    <w:p>
+      <w:pPr>
+        <w:pStyle w:val="ListBullet"/>
+      </w:pPr>
+      <w:r>
+        <w:rPr>
+          <w:rFonts w:ascii="Calibri" w:hAnsi="Calibri"/>
+          <w:color w:val="1E1C1C"/>
+          <w:sz w:val="21"/>
+        </w:rPr>
+        <w:t>Show final outputs and next actions.</w:t>
+      </w:r>
+    </w:p>
+    <w:p>
+      <w:pPr>
+        <w:pStyle w:val="ListBullet"/>
+      </w:pPr>
+      <w:r>
+        <w:rPr>
+          <w:rFonts w:ascii="Calibri" w:hAnsi="Calibri"/>
+          <w:color w:val="1E1C1C"/>
+          <w:sz w:val="21"/>
+        </w:rPr>
+        <w:t>Pause/stop Power Mode later.</w:t>
+      </w:r>
+    </w:p>
+    <w:p>
+      <w:pPr>
+        <w:spacing w:before="0" w:after="120" w:line="300" w:lineRule="auto"/>
+      </w:pPr>
+      <w:r>
+        <w:rPr>
+          <w:rFonts w:ascii="Calibri" w:hAnsi="Calibri"/>
+          <w:color w:val="1E1C1C"/>
+          <w:sz w:val="22"/>
+        </w:rPr>
+        <w:t>Command Center responsibilities:</w:t>
+      </w:r>
+    </w:p>
+    <w:p>
+      <w:pPr>
+        <w:pStyle w:val="ListBullet"/>
+      </w:pPr>
+      <w:r>
+        <w:rPr>
+          <w:rFonts w:ascii="Calibri" w:hAnsi="Calibri"/>
+          <w:color w:val="1E1C1C"/>
+          <w:sz w:val="21"/>
+        </w:rPr>
+        <w:t>Account and subscription.</w:t>
+      </w:r>
+    </w:p>
+    <w:p>
+      <w:pPr>
+        <w:pStyle w:val="ListBullet"/>
+      </w:pPr>
+      <w:r>
+        <w:rPr>
+          <w:rFonts w:ascii="Calibri" w:hAnsi="Calibri"/>
+          <w:color w:val="1E1C1C"/>
+          <w:sz w:val="21"/>
+        </w:rPr>
+        <w:t>Billing portal access.</w:t>
+      </w:r>
+    </w:p>
+    <w:p>
+      <w:pPr>
+        <w:pStyle w:val="ListBullet"/>
+      </w:pPr>
+      <w:r>
+        <w:rPr>
+          <w:rFonts w:ascii="Calibri" w:hAnsi="Calibri"/>
+          <w:color w:val="1E1C1C"/>
+          <w:sz w:val="21"/>
+        </w:rPr>
+        <w:t>Settings.</w:t>
+      </w:r>
+    </w:p>
+    <w:p>
+      <w:pPr>
+        <w:pStyle w:val="ListBullet"/>
+      </w:pPr>
+      <w:r>
+        <w:rPr>
+          <w:rFonts w:ascii="Calibri" w:hAnsi="Calibri"/>
+          <w:color w:val="1E1C1C"/>
+          <w:sz w:val="21"/>
+        </w:rPr>
+        <w:t>Permission center.</w:t>
+      </w:r>
+    </w:p>
+    <w:p>
+      <w:pPr>
+        <w:pStyle w:val="ListBullet"/>
+      </w:pPr>
+      <w:r>
+        <w:rPr>
+          <w:rFonts w:ascii="Calibri" w:hAnsi="Calibri"/>
+          <w:color w:val="1E1C1C"/>
+          <w:sz w:val="21"/>
+        </w:rPr>
+        <w:t>Privacy controls.</w:t>
+      </w:r>
+    </w:p>
+    <w:p>
+      <w:pPr>
+        <w:pStyle w:val="ListBullet"/>
+      </w:pPr>
+      <w:r>
+        <w:rPr>
+          <w:rFonts w:ascii="Calibri" w:hAnsi="Calibri"/>
+          <w:color w:val="1E1C1C"/>
+          <w:sz w:val="21"/>
+        </w:rPr>
+        <w:t>Data Sent To AI history.</w:t>
+      </w:r>
+    </w:p>
+    <w:p>
+      <w:pPr>
+        <w:pStyle w:val="ListBullet"/>
+      </w:pPr>
+      <w:r>
+        <w:rPr>
+          <w:rFonts w:ascii="Calibri" w:hAnsi="Calibri"/>
+          <w:color w:val="1E1C1C"/>
+          <w:sz w:val="21"/>
+        </w:rPr>
+        <w:t>Agent activity timeline.</w:t>
+      </w:r>
+    </w:p>
+    <w:p>
+      <w:pPr>
+        <w:pStyle w:val="ListBullet"/>
+      </w:pPr>
+      <w:r>
+        <w:rPr>
+          <w:rFonts w:ascii="Calibri" w:hAnsi="Calibri"/>
+          <w:color w:val="1E1C1C"/>
+          <w:sz w:val="21"/>
+        </w:rPr>
+        <w:t>Usage and impact stats.</w:t>
+      </w:r>
+    </w:p>
+    <w:p>
+      <w:pPr>
+        <w:pStyle w:val="ListBullet"/>
+      </w:pPr>
+      <w:r>
+        <w:rPr>
+          <w:rFonts w:ascii="Calibri" w:hAnsi="Calibri"/>
+          <w:color w:val="1E1C1C"/>
+          <w:sz w:val="21"/>
+        </w:rPr>
+        <w:t>Routine editor.</w:t>
+      </w:r>
+    </w:p>
+    <w:p>
+      <w:pPr>
+        <w:pStyle w:val="ListBullet"/>
+      </w:pPr>
+      <w:r>
+        <w:rPr>
+          <w:rFonts w:ascii="Calibri" w:hAnsi="Calibri"/>
+          <w:color w:val="1E1C1C"/>
+          <w:sz w:val="21"/>
+        </w:rPr>
+        <w:t>Workspace editor.</w:t>
+      </w:r>
+    </w:p>
+    <w:p>
+      <w:pPr>
+        <w:pStyle w:val="ListBullet"/>
+      </w:pPr>
+      <w:r>
+        <w:rPr>
+          <w:rFonts w:ascii="Calibri" w:hAnsi="Calibri"/>
+          <w:color w:val="1E1C1C"/>
+          <w:sz w:val="21"/>
+        </w:rPr>
+        <w:t>App approval controls for Power Mode.</w:t>
+      </w:r>
+    </w:p>
+    <w:p>
+      <w:pPr>
+        <w:pStyle w:val="ListBullet"/>
+      </w:pPr>
+      <w:r>
+        <w:rPr>
+          <w:rFonts w:ascii="Calibri" w:hAnsi="Calibri"/>
+          <w:color w:val="1E1C1C"/>
+          <w:sz w:val="21"/>
+        </w:rPr>
+        <w:t>Enterprise/admin controls later.</w:t>
+      </w:r>
+    </w:p>
+    <w:p>
+      <w:pPr>
+        <w:spacing w:before="0" w:after="120" w:line="300" w:lineRule="auto"/>
+      </w:pPr>
+      <w:r>
+        <w:rPr>
+          <w:rFonts w:ascii="Calibri" w:hAnsi="Calibri"/>
+          <w:color w:val="1E1C1C"/>
+          <w:sz w:val="22"/>
+        </w:rPr>
+        <w:t>Stats and activity principles:</w:t>
+      </w:r>
+    </w:p>
+    <w:p>
+      <w:pPr>
+        <w:pStyle w:val="ListBullet"/>
+      </w:pPr>
+      <w:r>
+        <w:rPr>
+          <w:rFonts w:ascii="Calibri" w:hAnsi="Calibri"/>
+          <w:color w:val="1E1C1C"/>
+          <w:sz w:val="21"/>
+        </w:rPr>
+        <w:t>Track useful work outcomes, not surveillance.</w:t>
+      </w:r>
+    </w:p>
+    <w:p>
+      <w:pPr>
+        <w:pStyle w:val="ListBullet"/>
+      </w:pPr>
+      <w:r>
+        <w:rPr>
+          <w:rFonts w:ascii="Calibri" w:hAnsi="Calibri"/>
+          <w:color w:val="1E1C1C"/>
+          <w:sz w:val="21"/>
+        </w:rPr>
+        <w:t>Aggregate locally where possible.</w:t>
+      </w:r>
+    </w:p>
+    <w:p>
+      <w:pPr>
+        <w:pStyle w:val="ListBullet"/>
+      </w:pPr>
+      <w:r>
+        <w:rPr>
+          <w:rFonts w:ascii="Calibri" w:hAnsi="Calibri"/>
+          <w:color w:val="1E1C1C"/>
+          <w:sz w:val="21"/>
+        </w:rPr>
+        <w:t>Let users disable or delete history.</w:t>
+      </w:r>
+    </w:p>
+    <w:p>
+      <w:pPr>
+        <w:pStyle w:val="ListBullet"/>
+      </w:pPr>
+      <w:r>
+        <w:rPr>
+          <w:rFonts w:ascii="Calibri" w:hAnsi="Calibri"/>
+          <w:color w:val="1E1C1C"/>
+          <w:sz w:val="21"/>
+        </w:rPr>
+        <w:t>Make any server-synced analytics explicit.</w:t>
+      </w:r>
+    </w:p>
+    <w:p>
+      <w:pPr>
+        <w:pStyle w:val="ListBullet"/>
+      </w:pPr>
+      <w:r>
+        <w:rPr>
+          <w:rFonts w:ascii="Calibri" w:hAnsi="Calibri"/>
+          <w:color w:val="1E1C1C"/>
+          <w:sz w:val="21"/>
+        </w:rPr>
+        <w:t>Do not store raw screen/audio history for stats.</w:t>
+      </w:r>
+    </w:p>
+    <w:p>
+      <w:pPr>
+        <w:pStyle w:val="Heading2"/>
+      </w:pPr>
+      <w:r>
         <w:t>6.4 Screen-Aware Context</w:t>
       </w:r>
     </w:p>
@@ -4067,6 +6762,32 @@
           <w:color w:val="1E1C1C"/>
           <w:sz w:val="21"/>
         </w:rPr>
+        <w:t>Fetch and parse public web pages from arbitrary safe `http`/`https` URLs.</w:t>
+      </w:r>
+    </w:p>
+    <w:p>
+      <w:pPr>
+        <w:pStyle w:val="ListBullet"/>
+      </w:pPr>
+      <w:r>
+        <w:rPr>
+          <w:rFonts w:ascii="Calibri" w:hAnsi="Calibri"/>
+          <w:color w:val="1E1C1C"/>
+          <w:sz w:val="21"/>
+        </w:rPr>
+        <w:t>Convert public web pages, active browser pages, and search results into Markdown notes.</w:t>
+      </w:r>
+    </w:p>
+    <w:p>
+      <w:pPr>
+        <w:pStyle w:val="ListBullet"/>
+      </w:pPr>
+      <w:r>
+        <w:rPr>
+          <w:rFonts w:ascii="Calibri" w:hAnsi="Calibri"/>
+          <w:color w:val="1E1C1C"/>
+          <w:sz w:val="21"/>
+        </w:rPr>
         <w:t>Summarize page.</w:t>
       </w:r>
     </w:p>
@@ -4106,6 +6827,19 @@
           <w:color w:val="1E1C1C"/>
           <w:sz w:val="21"/>
         </w:rPr>
+        <w:t>Extract citations and source metadata.</w:t>
+      </w:r>
+    </w:p>
+    <w:p>
+      <w:pPr>
+        <w:pStyle w:val="ListBullet"/>
+      </w:pPr>
+      <w:r>
+        <w:rPr>
+          <w:rFonts w:ascii="Calibri" w:hAnsi="Calibri"/>
+          <w:color w:val="1E1C1C"/>
+          <w:sz w:val="21"/>
+        </w:rPr>
         <w:t>Compare multiple pages or tabs when context is provided.</w:t>
       </w:r>
     </w:p>
@@ -4163,6 +6897,19 @@
     </w:p>
     <w:p>
       <w:pPr>
+        <w:pStyle w:val="ListBullet"/>
+      </w:pPr>
+      <w:r>
+        <w:rPr>
+          <w:rFonts w:ascii="Calibri" w:hAnsi="Calibri"/>
+          <w:color w:val="1E1C1C"/>
+          <w:sz w:val="21"/>
+        </w:rPr>
+        <w:t>Preserve Hacker News as a specialized source adapter, not a one-off workflow.</w:t>
+      </w:r>
+    </w:p>
+    <w:p>
+      <w:pPr>
         <w:spacing w:before="0" w:after="120" w:line="300" w:lineRule="auto"/>
       </w:pPr>
       <w:r>
@@ -4241,6 +6988,32 @@
     </w:p>
     <w:p>
       <w:pPr>
+        <w:pStyle w:val="ListBullet"/>
+      </w:pPr>
+      <w:r>
+        <w:rPr>
+          <w:rFonts w:ascii="Calibri" w:hAnsi="Calibri"/>
+          <w:color w:val="1E1C1C"/>
+          <w:sz w:val="21"/>
+        </w:rPr>
+        <w:t>"Turn this URL into a Markdown brief."</w:t>
+      </w:r>
+    </w:p>
+    <w:p>
+      <w:pPr>
+        <w:pStyle w:val="ListBullet"/>
+      </w:pPr>
+      <w:r>
+        <w:rPr>
+          <w:rFonts w:ascii="Calibri" w:hAnsi="Calibri"/>
+          <w:color w:val="1E1C1C"/>
+          <w:sz w:val="21"/>
+        </w:rPr>
+        <w:t>"Find current writing about AI Mac agents and save the best sources."</w:t>
+      </w:r>
+    </w:p>
+    <w:p>
+      <w:pPr>
         <w:spacing w:before="0" w:after="120" w:line="300" w:lineRule="auto"/>
       </w:pPr>
       <w:r>
@@ -4293,6 +7066,32 @@
     </w:p>
     <w:p>
       <w:pPr>
+        <w:pStyle w:val="ListBullet"/>
+      </w:pPr>
+      <w:r>
+        <w:rPr>
+          <w:rFonts w:ascii="Calibri" w:hAnsi="Calibri"/>
+          <w:color w:val="1E1C1C"/>
+          <w:sz w:val="21"/>
+        </w:rPr>
+        <w:t>Sonny must not bypass paywalls, CAPTCHAs, login walls, or robots restrictions.</w:t>
+      </w:r>
+    </w:p>
+    <w:p>
+      <w:pPr>
+        <w:pStyle w:val="ListBullet"/>
+      </w:pPr>
+      <w:r>
+        <w:rPr>
+          <w:rFonts w:ascii="Calibri" w:hAnsi="Calibri"/>
+          <w:color w:val="1E1C1C"/>
+          <w:sz w:val="21"/>
+        </w:rPr>
+        <w:t>Logged-in/private browser page extraction must require explicit user context selection and must show in Data Sent To AI.</w:t>
+      </w:r>
+    </w:p>
+    <w:p>
+      <w:pPr>
         <w:pStyle w:val="Heading2"/>
       </w:pPr>
       <w:r>
@@ -15068,6 +17867,32 @@
           <w:color w:val="1E1C1C"/>
           <w:sz w:val="21"/>
         </w:rPr>
+        <w:t>Fetch arbitrary public `http`/`https` pages.</w:t>
+      </w:r>
+    </w:p>
+    <w:p>
+      <w:pPr>
+        <w:pStyle w:val="ListBullet"/>
+      </w:pPr>
+      <w:r>
+        <w:rPr>
+          <w:rFonts w:ascii="Calibri" w:hAnsi="Calibri"/>
+          <w:color w:val="1E1C1C"/>
+          <w:sz w:val="21"/>
+        </w:rPr>
+        <w:t>Extract readable page content.</w:t>
+      </w:r>
+    </w:p>
+    <w:p>
+      <w:pPr>
+        <w:pStyle w:val="ListBullet"/>
+      </w:pPr>
+      <w:r>
+        <w:rPr>
+          <w:rFonts w:ascii="Calibri" w:hAnsi="Calibri"/>
+          <w:color w:val="1E1C1C"/>
+          <w:sz w:val="21"/>
+        </w:rPr>
         <w:t>Summarize page.</w:t>
       </w:r>
     </w:p>
@@ -15151,6 +17976,32 @@
     </w:p>
     <w:p>
       <w:pPr>
+        <w:pStyle w:val="ListBullet"/>
+      </w:pPr>
+      <w:r>
+        <w:rPr>
+          <w:rFonts w:ascii="Calibri" w:hAnsi="Calibri"/>
+          <w:color w:val="1E1C1C"/>
+          <w:sz w:val="21"/>
+        </w:rPr>
+        <w:t>Preserve source URLs and retrieval timestamps.</w:t>
+      </w:r>
+    </w:p>
+    <w:p>
+      <w:pPr>
+        <w:pStyle w:val="ListBullet"/>
+      </w:pPr>
+      <w:r>
+        <w:rPr>
+          <w:rFonts w:ascii="Calibri" w:hAnsi="Calibri"/>
+          <w:color w:val="1E1C1C"/>
+          <w:sz w:val="21"/>
+        </w:rPr>
+        <w:t>Keep Hacker News as a provider preset under the general web research system.</w:t>
+      </w:r>
+    </w:p>
+    <w:p>
+      <w:pPr>
         <w:spacing w:before="0" w:after="120" w:line="300" w:lineRule="auto"/>
       </w:pPr>
       <w:r>
@@ -15203,6 +18054,32 @@
     </w:p>
     <w:p>
       <w:pPr>
+        <w:pStyle w:val="ListBullet"/>
+      </w:pPr>
+      <w:r>
+        <w:rPr>
+          <w:rFonts w:ascii="Calibri" w:hAnsi="Calibri"/>
+          <w:color w:val="1E1C1C"/>
+          <w:sz w:val="21"/>
+        </w:rPr>
+        <w:t>User can turn a direct URL into a Markdown brief.</w:t>
+      </w:r>
+    </w:p>
+    <w:p>
+      <w:pPr>
+        <w:pStyle w:val="ListBullet"/>
+      </w:pPr>
+      <w:r>
+        <w:rPr>
+          <w:rFonts w:ascii="Calibri" w:hAnsi="Calibri"/>
+          <w:color w:val="1E1C1C"/>
+          <w:sz w:val="21"/>
+        </w:rPr>
+        <w:t>User can run the old Hacker News workflow through the same generalized web-to-Markdown capability.</w:t>
+      </w:r>
+    </w:p>
+    <w:p>
+      <w:pPr>
         <w:pStyle w:val="Heading2"/>
       </w:pPr>
       <w:r>
@@ -15682,6 +18559,248 @@
     </w:p>
     <w:p>
       <w:pPr>
+        <w:pStyle w:val="Heading2"/>
+      </w:pPr>
+      <w:r>
+        <w:t>18.5 Media Playback</w:t>
+      </w:r>
+    </w:p>
+    <w:p>
+      <w:pPr>
+        <w:spacing w:before="0" w:after="120" w:line="300" w:lineRule="auto"/>
+      </w:pPr>
+      <w:r>
+        <w:rPr>
+          <w:rFonts w:ascii="Calibri" w:hAnsi="Calibri"/>
+          <w:color w:val="1E1C1C"/>
+          <w:sz w:val="22"/>
+        </w:rPr>
+        <w:t>Media should graduate from opening search results to provider-aware playback where the provider allows it.</w:t>
+      </w:r>
+    </w:p>
+    <w:p>
+      <w:pPr>
+        <w:spacing w:before="0" w:after="120" w:line="300" w:lineRule="auto"/>
+      </w:pPr>
+      <w:r>
+        <w:rPr>
+          <w:rFonts w:ascii="Calibri" w:hAnsi="Calibri"/>
+          <w:color w:val="1E1C1C"/>
+          <w:sz w:val="22"/>
+        </w:rPr>
+        <w:t>Capabilities:</w:t>
+      </w:r>
+    </w:p>
+    <w:p>
+      <w:pPr>
+        <w:pStyle w:val="ListBullet"/>
+      </w:pPr>
+      <w:r>
+        <w:rPr>
+          <w:rFonts w:ascii="Calibri" w:hAnsi="Calibri"/>
+          <w:color w:val="1E1C1C"/>
+          <w:sz w:val="21"/>
+        </w:rPr>
+        <w:t>Search Apple Music catalog.</w:t>
+      </w:r>
+    </w:p>
+    <w:p>
+      <w:pPr>
+        <w:pStyle w:val="ListBullet"/>
+      </w:pPr>
+      <w:r>
+        <w:rPr>
+          <w:rFonts w:ascii="Calibri" w:hAnsi="Calibri"/>
+          <w:color w:val="1E1C1C"/>
+          <w:sz w:val="21"/>
+        </w:rPr>
+        <w:t>Search Spotify catalog.</w:t>
+      </w:r>
+    </w:p>
+    <w:p>
+      <w:pPr>
+        <w:pStyle w:val="ListBullet"/>
+      </w:pPr>
+      <w:r>
+        <w:rPr>
+          <w:rFonts w:ascii="Calibri" w:hAnsi="Calibri"/>
+          <w:color w:val="1E1C1C"/>
+          <w:sz w:val="21"/>
+        </w:rPr>
+        <w:t>Resolve exact track/album/artist matches.</w:t>
+      </w:r>
+    </w:p>
+    <w:p>
+      <w:pPr>
+        <w:pStyle w:val="ListBullet"/>
+      </w:pPr>
+      <w:r>
+        <w:rPr>
+          <w:rFonts w:ascii="Calibri" w:hAnsi="Calibri"/>
+          <w:color w:val="1E1C1C"/>
+          <w:sz w:val="21"/>
+        </w:rPr>
+        <w:t>Play exact Spotify track/album through Spotify Web API when the user has connected Spotify, granted playback scope, has Premium, and has an active device.</w:t>
+      </w:r>
+    </w:p>
+    <w:p>
+      <w:pPr>
+        <w:pStyle w:val="ListBullet"/>
+      </w:pPr>
+      <w:r>
+        <w:rPr>
+          <w:rFonts w:ascii="Calibri" w:hAnsi="Calibri"/>
+          <w:color w:val="1E1C1C"/>
+          <w:sz w:val="21"/>
+        </w:rPr>
+        <w:t>Play exact Apple Music track/album through MusicKit when the user has granted authorization and has playback entitlement/subscription.</w:t>
+      </w:r>
+    </w:p>
+    <w:p>
+      <w:pPr>
+        <w:pStyle w:val="ListBullet"/>
+      </w:pPr>
+      <w:r>
+        <w:rPr>
+          <w:rFonts w:ascii="Calibri" w:hAnsi="Calibri"/>
+          <w:color w:val="1E1C1C"/>
+          <w:sz w:val="21"/>
+        </w:rPr>
+        <w:t>Open exact provider result as fallback when playback is not authorized or unavailable.</w:t>
+      </w:r>
+    </w:p>
+    <w:p>
+      <w:pPr>
+        <w:pStyle w:val="ListBullet"/>
+      </w:pPr>
+      <w:r>
+        <w:rPr>
+          <w:rFonts w:ascii="Calibri" w:hAnsi="Calibri"/>
+          <w:color w:val="1E1C1C"/>
+          <w:sz w:val="21"/>
+        </w:rPr>
+        <w:t>Explain provider-specific limitations in the final summary.</w:t>
+      </w:r>
+    </w:p>
+    <w:p>
+      <w:pPr>
+        <w:spacing w:before="0" w:after="120" w:line="300" w:lineRule="auto"/>
+      </w:pPr>
+      <w:r>
+        <w:rPr>
+          <w:rFonts w:ascii="Calibri" w:hAnsi="Calibri"/>
+          <w:color w:val="1E1C1C"/>
+          <w:sz w:val="22"/>
+        </w:rPr>
+        <w:t>Acceptance examples:</w:t>
+      </w:r>
+    </w:p>
+    <w:p>
+      <w:pPr>
+        <w:pStyle w:val="ListBullet"/>
+      </w:pPr>
+      <w:r>
+        <w:rPr>
+          <w:rFonts w:ascii="Calibri" w:hAnsi="Calibri"/>
+          <w:color w:val="1E1C1C"/>
+          <w:sz w:val="21"/>
+        </w:rPr>
+        <w:t>User can say "Play Jimmy Cooks by Drake on Spotify" and Sonny starts the exact track when Spotify requirements are met.</w:t>
+      </w:r>
+    </w:p>
+    <w:p>
+      <w:pPr>
+        <w:pStyle w:val="ListBullet"/>
+      </w:pPr>
+      <w:r>
+        <w:rPr>
+          <w:rFonts w:ascii="Calibri" w:hAnsi="Calibri"/>
+          <w:color w:val="1E1C1C"/>
+          <w:sz w:val="21"/>
+        </w:rPr>
+        <w:t>User can say "Play SZA on Apple Music" and Sonny queues/plays the best matching catalog result when MusicKit requirements are met.</w:t>
+      </w:r>
+    </w:p>
+    <w:p>
+      <w:pPr>
+        <w:pStyle w:val="ListBullet"/>
+      </w:pPr>
+      <w:r>
+        <w:rPr>
+          <w:rFonts w:ascii="Calibri" w:hAnsi="Calibri"/>
+          <w:color w:val="1E1C1C"/>
+          <w:sz w:val="21"/>
+        </w:rPr>
+        <w:t>If playback cannot start, Sonny opens the exact result and states whether the blocker is authorization, subscription, active device, or provider limitation.</w:t>
+      </w:r>
+    </w:p>
+    <w:p>
+      <w:pPr>
+        <w:spacing w:before="0" w:after="120" w:line="300" w:lineRule="auto"/>
+      </w:pPr>
+      <w:r>
+        <w:rPr>
+          <w:rFonts w:ascii="Calibri" w:hAnsi="Calibri"/>
+          <w:color w:val="1E1C1C"/>
+          <w:sz w:val="22"/>
+        </w:rPr>
+        <w:t>Implementation notes:</w:t>
+      </w:r>
+    </w:p>
+    <w:p>
+      <w:pPr>
+        <w:pStyle w:val="ListBullet"/>
+      </w:pPr>
+      <w:r>
+        <w:rPr>
+          <w:rFonts w:ascii="Calibri" w:hAnsi="Calibri"/>
+          <w:color w:val="1E1C1C"/>
+          <w:sz w:val="21"/>
+        </w:rPr>
+        <w:t>Spotify playback should use OAuth + PKCE, catalog search, device lookup/transfer when needed, and `PUT /v1/me/player/play`.</w:t>
+      </w:r>
+    </w:p>
+    <w:p>
+      <w:pPr>
+        <w:pStyle w:val="ListBullet"/>
+      </w:pPr>
+      <w:r>
+        <w:rPr>
+          <w:rFonts w:ascii="Calibri" w:hAnsi="Calibri"/>
+          <w:color w:val="1E1C1C"/>
+          <w:sz w:val="21"/>
+        </w:rPr>
+        <w:t>Apple Music playback should use MusicKit catalog search and `ApplicationMusicPlayer` where possible.</w:t>
+      </w:r>
+    </w:p>
+    <w:p>
+      <w:pPr>
+        <w:pStyle w:val="ListBullet"/>
+      </w:pPr>
+      <w:r>
+        <w:rPr>
+          <w:rFonts w:ascii="Calibri" w:hAnsi="Calibri"/>
+          <w:color w:val="1E1C1C"/>
+          <w:sz w:val="21"/>
+        </w:rPr>
+        <w:t>Music app AppleScript is only a local-library fallback, not the primary strategy for catalog playback.</w:t>
+      </w:r>
+    </w:p>
+    <w:p>
+      <w:pPr>
+        <w:pStyle w:val="ListBullet"/>
+      </w:pPr>
+      <w:r>
+        <w:rPr>
+          <w:rFonts w:ascii="Calibri" w:hAnsi="Calibri"/>
+          <w:color w:val="1E1C1C"/>
+          <w:sz w:val="21"/>
+        </w:rPr>
+        <w:t>Power Mode UI clicking should not be the primary playback mechanism.</w:t>
+      </w:r>
+    </w:p>
+    <w:p>
+      <w:pPr>
         <w:pStyle w:val="Heading1"/>
       </w:pPr>
       <w:r>
@@ -17916,6 +21035,183 @@
     </w:p>
     <w:p>
       <w:pPr>
+        <w:pStyle w:val="Heading2"/>
+      </w:pPr>
+      <w:r>
+        <w:t>20.8 Pre-Major-Release Generalization Tests</w:t>
+      </w:r>
+    </w:p>
+    <w:p>
+      <w:pPr>
+        <w:spacing w:before="0" w:after="120" w:line="300" w:lineRule="auto"/>
+      </w:pPr>
+      <w:r>
+        <w:rPr>
+          <w:rFonts w:ascii="Calibri" w:hAnsi="Calibri"/>
+          <w:color w:val="1E1C1C"/>
+          <w:sz w:val="22"/>
+        </w:rPr>
+        <w:t>Before starting hosted-agent and Power Mode implementation:</w:t>
+      </w:r>
+    </w:p>
+    <w:p>
+      <w:pPr>
+        <w:pStyle w:val="ListBullet"/>
+      </w:pPr>
+      <w:r>
+        <w:rPr>
+          <w:rFonts w:ascii="Calibri" w:hAnsi="Calibri"/>
+          <w:color w:val="1E1C1C"/>
+          <w:sz w:val="21"/>
+        </w:rPr>
+        <w:t>Existing HN workflow still saves Markdown.</w:t>
+      </w:r>
+    </w:p>
+    <w:p>
+      <w:pPr>
+        <w:pStyle w:val="ListBullet"/>
+      </w:pPr>
+      <w:r>
+        <w:rPr>
+          <w:rFonts w:ascii="Calibri" w:hAnsi="Calibri"/>
+          <w:color w:val="1E1C1C"/>
+          <w:sz w:val="21"/>
+        </w:rPr>
+        <w:t>Generic direct URL saves Markdown with source metadata.</w:t>
+      </w:r>
+    </w:p>
+    <w:p>
+      <w:pPr>
+        <w:pStyle w:val="ListBullet"/>
+      </w:pPr>
+      <w:r>
+        <w:rPr>
+          <w:rFonts w:ascii="Calibri" w:hAnsi="Calibri"/>
+          <w:color w:val="1E1C1C"/>
+          <w:sz w:val="21"/>
+        </w:rPr>
+        <w:t>Generic topic/search request saves Markdown with source links.</w:t>
+      </w:r>
+    </w:p>
+    <w:p>
+      <w:pPr>
+        <w:pStyle w:val="ListBullet"/>
+      </w:pPr>
+      <w:r>
+        <w:rPr>
+          <w:rFonts w:ascii="Calibri" w:hAnsi="Calibri"/>
+          <w:color w:val="1E1C1C"/>
+          <w:sz w:val="21"/>
+        </w:rPr>
+        <w:t>Malicious webpage instruction text is treated as untrusted content.</w:t>
+      </w:r>
+    </w:p>
+    <w:p>
+      <w:pPr>
+        <w:pStyle w:val="ListBullet"/>
+      </w:pPr>
+      <w:r>
+        <w:rPr>
+          <w:rFonts w:ascii="Calibri" w:hAnsi="Calibri"/>
+          <w:color w:val="1E1C1C"/>
+          <w:sz w:val="21"/>
+        </w:rPr>
+        <w:t>Existing safe URL opening still works.</w:t>
+      </w:r>
+    </w:p>
+    <w:p>
+      <w:pPr>
+        <w:pStyle w:val="ListBullet"/>
+      </w:pPr>
+      <w:r>
+        <w:rPr>
+          <w:rFonts w:ascii="Calibri" w:hAnsi="Calibri"/>
+          <w:color w:val="1E1C1C"/>
+          <w:sz w:val="21"/>
+        </w:rPr>
+        <w:t>Existing app opening still works.</w:t>
+      </w:r>
+    </w:p>
+    <w:p>
+      <w:pPr>
+        <w:pStyle w:val="ListBullet"/>
+      </w:pPr>
+      <w:r>
+        <w:rPr>
+          <w:rFonts w:ascii="Calibri" w:hAnsi="Calibri"/>
+          <w:color w:val="1E1C1C"/>
+          <w:sz w:val="21"/>
+        </w:rPr>
+        <w:t>New app/website adapter definitions reject unsupported actions.</w:t>
+      </w:r>
+    </w:p>
+    <w:p>
+      <w:pPr>
+        <w:pStyle w:val="ListBullet"/>
+      </w:pPr>
+      <w:r>
+        <w:rPr>
+          <w:rFonts w:ascii="Calibri" w:hAnsi="Calibri"/>
+          <w:color w:val="1E1C1C"/>
+          <w:sz w:val="21"/>
+        </w:rPr>
+        <w:t>Existing media result opening still works as fallback.</w:t>
+      </w:r>
+    </w:p>
+    <w:p>
+      <w:pPr>
+        <w:pStyle w:val="ListBullet"/>
+      </w:pPr>
+      <w:r>
+        <w:rPr>
+          <w:rFonts w:ascii="Calibri" w:hAnsi="Calibri"/>
+          <w:color w:val="1E1C1C"/>
+          <w:sz w:val="21"/>
+        </w:rPr>
+        <w:t>Spotify playback adapter handles success, no Premium, no active device, missing OAuth scope, and API rate-limit states.</w:t>
+      </w:r>
+    </w:p>
+    <w:p>
+      <w:pPr>
+        <w:pStyle w:val="ListBullet"/>
+      </w:pPr>
+      <w:r>
+        <w:rPr>
+          <w:rFonts w:ascii="Calibri" w:hAnsi="Calibri"/>
+          <w:color w:val="1E1C1C"/>
+          <w:sz w:val="21"/>
+        </w:rPr>
+        <w:t>Apple Music adapter handles authorized playback, missing authorization, missing subscription, no exact match, and local-library fallback states.</w:t>
+      </w:r>
+    </w:p>
+    <w:p>
+      <w:pPr>
+        <w:pStyle w:val="ListBullet"/>
+      </w:pPr>
+      <w:r>
+        <w:rPr>
+          <w:rFonts w:ascii="Calibri" w:hAnsi="Calibri"/>
+          <w:color w:val="1E1C1C"/>
+          <w:sz w:val="21"/>
+        </w:rPr>
+        <w:t>Command Center stats update from task completion without storing raw screen/audio.</w:t>
+      </w:r>
+    </w:p>
+    <w:p>
+      <w:pPr>
+        <w:pStyle w:val="ListBullet"/>
+      </w:pPr>
+      <w:r>
+        <w:rPr>
+          <w:rFonts w:ascii="Calibri" w:hAnsi="Calibri"/>
+          <w:color w:val="1E1C1C"/>
+          <w:sz w:val="21"/>
+        </w:rPr>
+        <w:t>User can delete local activity/history.</w:t>
+      </w:r>
+    </w:p>
+    <w:p>
+      <w:pPr>
         <w:pStyle w:val="Heading1"/>
       </w:pPr>
       <w:r>
@@ -17927,6 +21223,261 @@
         <w:pStyle w:val="Heading2"/>
       </w:pPr>
       <w:r>
+        <w:t>21.0 Workstream 0: Pre-Major-Release Generalization</w:t>
+      </w:r>
+    </w:p>
+    <w:p>
+      <w:pPr>
+        <w:spacing w:before="0" w:after="120" w:line="300" w:lineRule="auto"/>
+      </w:pPr>
+      <w:r>
+        <w:rPr>
+          <w:rFonts w:ascii="Calibri" w:hAnsi="Calibri"/>
+          <w:color w:val="1E1C1C"/>
+          <w:sz w:val="22"/>
+        </w:rPr>
+        <w:t>Goals:</w:t>
+      </w:r>
+    </w:p>
+    <w:p>
+      <w:pPr>
+        <w:pStyle w:val="ListBullet"/>
+      </w:pPr>
+      <w:r>
+        <w:rPr>
+          <w:rFonts w:ascii="Calibri" w:hAnsi="Calibri"/>
+          <w:color w:val="1E1C1C"/>
+          <w:sz w:val="21"/>
+        </w:rPr>
+        <w:t>Make existing prototype capabilities more general before the large hosted-agent implementation begins.</w:t>
+      </w:r>
+    </w:p>
+    <w:p>
+      <w:pPr>
+        <w:pStyle w:val="ListBullet"/>
+      </w:pPr>
+      <w:r>
+        <w:rPr>
+          <w:rFonts w:ascii="Calibri" w:hAnsi="Calibri"/>
+          <w:color w:val="1E1C1C"/>
+          <w:sz w:val="21"/>
+        </w:rPr>
+        <w:t>Keep the current local prototype stable while removing narrow one-off behavior.</w:t>
+      </w:r>
+    </w:p>
+    <w:p>
+      <w:pPr>
+        <w:spacing w:before="0" w:after="120" w:line="300" w:lineRule="auto"/>
+      </w:pPr>
+      <w:r>
+        <w:rPr>
+          <w:rFonts w:ascii="Calibri" w:hAnsi="Calibri"/>
+          <w:color w:val="1E1C1C"/>
+          <w:sz w:val="22"/>
+        </w:rPr>
+        <w:t>Deliverables:</w:t>
+      </w:r>
+    </w:p>
+    <w:p>
+      <w:pPr>
+        <w:pStyle w:val="ListBullet"/>
+      </w:pPr>
+      <w:r>
+        <w:rPr>
+          <w:rFonts w:ascii="Calibri" w:hAnsi="Calibri"/>
+          <w:color w:val="1E1C1C"/>
+          <w:sz w:val="21"/>
+        </w:rPr>
+        <w:t>Menu-bar cockpit plus full Sonny Command Center shell.</w:t>
+      </w:r>
+    </w:p>
+    <w:p>
+      <w:pPr>
+        <w:pStyle w:val="ListBullet"/>
+      </w:pPr>
+      <w:r>
+        <w:rPr>
+          <w:rFonts w:ascii="Calibri" w:hAnsi="Calibri"/>
+          <w:color w:val="1E1C1C"/>
+          <w:sz w:val="21"/>
+        </w:rPr>
+        <w:t>Usage/impact stats model with privacy-safe defaults.</w:t>
+      </w:r>
+    </w:p>
+    <w:p>
+      <w:pPr>
+        <w:pStyle w:val="ListBullet"/>
+      </w:pPr>
+      <w:r>
+        <w:rPr>
+          <w:rFonts w:ascii="Calibri" w:hAnsi="Calibri"/>
+          <w:color w:val="1E1C1C"/>
+          <w:sz w:val="21"/>
+        </w:rPr>
+        <w:t>General web-to-Markdown capability replacing HN-only behavior.</w:t>
+      </w:r>
+    </w:p>
+    <w:p>
+      <w:pPr>
+        <w:pStyle w:val="ListBullet"/>
+      </w:pPr>
+      <w:r>
+        <w:rPr>
+          <w:rFonts w:ascii="Calibri" w:hAnsi="Calibri"/>
+          <w:color w:val="1E1C1C"/>
+          <w:sz w:val="21"/>
+        </w:rPr>
+        <w:t>HN retained as a provider preset.</w:t>
+      </w:r>
+    </w:p>
+    <w:p>
+      <w:pPr>
+        <w:pStyle w:val="ListBullet"/>
+      </w:pPr>
+      <w:r>
+        <w:rPr>
+          <w:rFonts w:ascii="Calibri" w:hAnsi="Calibri"/>
+          <w:color w:val="1E1C1C"/>
+          <w:sz w:val="21"/>
+        </w:rPr>
+        <w:t>Generic app/website adapter foundation.</w:t>
+      </w:r>
+    </w:p>
+    <w:p>
+      <w:pPr>
+        <w:pStyle w:val="ListBullet"/>
+      </w:pPr>
+      <w:r>
+        <w:rPr>
+          <w:rFonts w:ascii="Calibri" w:hAnsi="Calibri"/>
+          <w:color w:val="1E1C1C"/>
+          <w:sz w:val="21"/>
+        </w:rPr>
+        <w:t>Provider-aware media playback plan implemented behind adapters.</w:t>
+      </w:r>
+    </w:p>
+    <w:p>
+      <w:pPr>
+        <w:pStyle w:val="ListBullet"/>
+      </w:pPr>
+      <w:r>
+        <w:rPr>
+          <w:rFonts w:ascii="Calibri" w:hAnsi="Calibri"/>
+          <w:color w:val="1E1C1C"/>
+          <w:sz w:val="21"/>
+        </w:rPr>
+        <w:t>Spotify playback through OAuth/API with clear Premium/device fallback.</w:t>
+      </w:r>
+    </w:p>
+    <w:p>
+      <w:pPr>
+        <w:pStyle w:val="ListBullet"/>
+      </w:pPr>
+      <w:r>
+        <w:rPr>
+          <w:rFonts w:ascii="Calibri" w:hAnsi="Calibri"/>
+          <w:color w:val="1E1C1C"/>
+          <w:sz w:val="21"/>
+        </w:rPr>
+        <w:t>Apple Music playback through MusicKit where available with exact-result fallback.</w:t>
+      </w:r>
+    </w:p>
+    <w:p>
+      <w:pPr>
+        <w:pStyle w:val="ListBullet"/>
+      </w:pPr>
+      <w:r>
+        <w:rPr>
+          <w:rFonts w:ascii="Calibri" w:hAnsi="Calibri"/>
+          <w:color w:val="1E1C1C"/>
+          <w:sz w:val="21"/>
+        </w:rPr>
+        <w:t>Regression tests for every existing prototype feature.</w:t>
+      </w:r>
+    </w:p>
+    <w:p>
+      <w:pPr>
+        <w:spacing w:before="0" w:after="120" w:line="300" w:lineRule="auto"/>
+      </w:pPr>
+      <w:r>
+        <w:rPr>
+          <w:rFonts w:ascii="Calibri" w:hAnsi="Calibri"/>
+          <w:color w:val="1E1C1C"/>
+          <w:sz w:val="22"/>
+        </w:rPr>
+        <w:t>Exit criteria:</w:t>
+      </w:r>
+    </w:p>
+    <w:p>
+      <w:pPr>
+        <w:pStyle w:val="ListBullet"/>
+      </w:pPr>
+      <w:r>
+        <w:rPr>
+          <w:rFonts w:ascii="Calibri" w:hAnsi="Calibri"/>
+          <w:color w:val="1E1C1C"/>
+          <w:sz w:val="21"/>
+        </w:rPr>
+        <w:t>Existing zip, DOCX, HN, app opening, URL opening, routines, workspaces, voice, and hotkey flows still work.</w:t>
+      </w:r>
+    </w:p>
+    <w:p>
+      <w:pPr>
+        <w:pStyle w:val="ListBullet"/>
+      </w:pPr>
+      <w:r>
+        <w:rPr>
+          <w:rFonts w:ascii="Calibri" w:hAnsi="Calibri"/>
+          <w:color w:val="1E1C1C"/>
+          <w:sz w:val="21"/>
+        </w:rPr>
+        <w:t>A public URL can become a Markdown brief.</w:t>
+      </w:r>
+    </w:p>
+    <w:p>
+      <w:pPr>
+        <w:pStyle w:val="ListBullet"/>
+      </w:pPr>
+      <w:r>
+        <w:rPr>
+          <w:rFonts w:ascii="Calibri" w:hAnsi="Calibri"/>
+          <w:color w:val="1E1C1C"/>
+          <w:sz w:val="21"/>
+        </w:rPr>
+        <w:t>A topic/search command can become a Markdown research note with sources.</w:t>
+      </w:r>
+    </w:p>
+    <w:p>
+      <w:pPr>
+        <w:pStyle w:val="ListBullet"/>
+      </w:pPr>
+      <w:r>
+        <w:rPr>
+          <w:rFonts w:ascii="Calibri" w:hAnsi="Calibri"/>
+          <w:color w:val="1E1C1C"/>
+          <w:sz w:val="21"/>
+        </w:rPr>
+        <w:t>Media playback either starts correctly or explains the provider blocker.</w:t>
+      </w:r>
+    </w:p>
+    <w:p>
+      <w:pPr>
+        <w:pStyle w:val="ListBullet"/>
+      </w:pPr>
+      <w:r>
+        <w:rPr>
+          <w:rFonts w:ascii="Calibri" w:hAnsi="Calibri"/>
+          <w:color w:val="1E1C1C"/>
+          <w:sz w:val="21"/>
+        </w:rPr>
+        <w:t>No hosted backend, subscription, enterprise, or full Power Mode dependency is introduced yet.</w:t>
+      </w:r>
+    </w:p>
+    <w:p>
+      <w:pPr>
+        <w:pStyle w:val="Heading2"/>
+      </w:pPr>
+      <w:r>
         <w:t>21.1 Workstream A: Productization Of Current Mac App</w:t>
       </w:r>
     </w:p>
@@ -18044,6 +21595,19 @@
           <w:color w:val="1E1C1C"/>
           <w:sz w:val="21"/>
         </w:rPr>
+        <w:t>Full Sonny Command Center app surface.</w:t>
+      </w:r>
+    </w:p>
+    <w:p>
+      <w:pPr>
+        <w:pStyle w:val="ListBullet"/>
+      </w:pPr>
+      <w:r>
+        <w:rPr>
+          <w:rFonts w:ascii="Calibri" w:hAnsi="Calibri"/>
+          <w:color w:val="1E1C1C"/>
+          <w:sz w:val="21"/>
+        </w:rPr>
         <w:t>Account state.</w:t>
       </w:r>
     </w:p>
@@ -18083,6 +21647,19 @@
           <w:color w:val="1E1C1C"/>
           <w:sz w:val="21"/>
         </w:rPr>
+        <w:t>Privacy-safe usage and impact stats.</w:t>
+      </w:r>
+    </w:p>
+    <w:p>
+      <w:pPr>
+        <w:pStyle w:val="ListBullet"/>
+      </w:pPr>
+      <w:r>
+        <w:rPr>
+          <w:rFonts w:ascii="Calibri" w:hAnsi="Calibri"/>
+          <w:color w:val="1E1C1C"/>
+          <w:sz w:val="21"/>
+        </w:rPr>
         <w:t>Update mechanism plan or implementation.</w:t>
       </w:r>
     </w:p>
@@ -19010,6 +22587,32 @@
           <w:color w:val="1E1C1C"/>
           <w:sz w:val="21"/>
         </w:rPr>
+        <w:t>General web-to-Markdown.</w:t>
+      </w:r>
+    </w:p>
+    <w:p>
+      <w:pPr>
+        <w:pStyle w:val="ListBullet"/>
+      </w:pPr>
+      <w:r>
+        <w:rPr>
+          <w:rFonts w:ascii="Calibri" w:hAnsi="Calibri"/>
+          <w:color w:val="1E1C1C"/>
+          <w:sz w:val="21"/>
+        </w:rPr>
+        <w:t>Search/topic-to-Markdown.</w:t>
+      </w:r>
+    </w:p>
+    <w:p>
+      <w:pPr>
+        <w:pStyle w:val="ListBullet"/>
+      </w:pPr>
+      <w:r>
+        <w:rPr>
+          <w:rFonts w:ascii="Calibri" w:hAnsi="Calibri"/>
+          <w:color w:val="1E1C1C"/>
+          <w:sz w:val="21"/>
+        </w:rPr>
         <w:t>Downloads cleanup.</w:t>
       </w:r>
     </w:p>
@@ -19024,6 +22627,19 @@
           <w:sz w:val="21"/>
         </w:rPr>
         <w:t>Document summarization.</w:t>
+      </w:r>
+    </w:p>
+    <w:p>
+      <w:pPr>
+        <w:pStyle w:val="ListBullet"/>
+      </w:pPr>
+      <w:r>
+        <w:rPr>
+          <w:rFonts w:ascii="Calibri" w:hAnsi="Calibri"/>
+          <w:color w:val="1E1C1C"/>
+          <w:sz w:val="21"/>
+        </w:rPr>
+        <w:t>Media playback adapters.</w:t>
       </w:r>
     </w:p>
     <w:p>
@@ -20174,7 +23790,7 @@
           <w:color w:val="2B2B2B"/>
           <w:sz w:val="17"/>
         </w:rPr>
-        <w:t>- Power Mode is paid-only, off by default, approved-app scoped, and risk-gated.</w:t>
+        <w:t>- The menu-bar popover is the agent cockpit; the full Sonny app is the Command Center for account, settings, privacy, stats, routines, workspaces, permissions, and Power Mode controls.</w:t>
       </w:r>
     </w:p>
     <w:p>
@@ -20187,7 +23803,7 @@
           <w:color w:val="2B2B2B"/>
           <w:sz w:val="17"/>
         </w:rPr>
-        <w:t>- Privacy headline: hosted AI with local-first protection.</w:t>
+        <w:t>- Before the full major-release roadmap, preserve and generalize existing prototype features: generic web-to-Markdown, generic app/website adapters, and provider-aware media playback.</w:t>
       </w:r>
     </w:p>
     <w:p>
@@ -20200,7 +23816,7 @@
           <w:color w:val="2B2B2B"/>
           <w:sz w:val="17"/>
         </w:rPr>
-        <w:t>- V1 must cover both browser/research workflows and local file/document workflows with polish.</w:t>
+        <w:t>- Power Mode is paid-only, off by default, approved-app scoped, and risk-gated.</w:t>
       </w:r>
     </w:p>
     <w:p>
@@ -20213,7 +23829,7 @@
           <w:color w:val="2B2B2B"/>
           <w:sz w:val="17"/>
         </w:rPr>
-        <w:t xml:space="preserve"> </w:t>
+        <w:t>- Privacy headline: hosted AI with local-first protection.</w:t>
       </w:r>
     </w:p>
     <w:p>
@@ -20226,6 +23842,32 @@
           <w:color w:val="2B2B2B"/>
           <w:sz w:val="17"/>
         </w:rPr>
+        <w:t>- V1 must cover both browser/research workflows and local file/document workflows with polish.</w:t>
+      </w:r>
+    </w:p>
+    <w:p>
+      <w:pPr>
+        <w:pStyle w:val="CodeBlock"/>
+      </w:pPr>
+      <w:r>
+        <w:rPr>
+          <w:rFonts w:ascii="Courier New" w:hAnsi="Courier New"/>
+          <w:color w:val="2B2B2B"/>
+          <w:sz w:val="17"/>
+        </w:rPr>
+        <w:t xml:space="preserve"> </w:t>
+      </w:r>
+    </w:p>
+    <w:p>
+      <w:pPr>
+        <w:pStyle w:val="CodeBlock"/>
+      </w:pPr>
+      <w:r>
+        <w:rPr>
+          <w:rFonts w:ascii="Courier New" w:hAnsi="Courier New"/>
+          <w:color w:val="2B2B2B"/>
+          <w:sz w:val="17"/>
+        </w:rPr>
         <w:t>Now review the repo and then continue with the requested feature.</w:t>
       </w:r>
     </w:p>
@@ -20684,6 +24326,71 @@
     </w:p>
     <w:p>
       <w:pPr>
+        <w:pStyle w:val="ListBullet"/>
+      </w:pPr>
+      <w:r>
+        <w:rPr>
+          <w:rFonts w:ascii="Calibri" w:hAnsi="Calibri"/>
+          <w:color w:val="1E1C1C"/>
+          <w:sz w:val="21"/>
+        </w:rPr>
+        <w:t>Spotify Start/Resume Playback: https://developer.spotify.com/documentation/web-api/reference/start-a-users-playback</w:t>
+      </w:r>
+    </w:p>
+    <w:p>
+      <w:pPr>
+        <w:pStyle w:val="ListBullet"/>
+      </w:pPr>
+      <w:r>
+        <w:rPr>
+          <w:rFonts w:ascii="Calibri" w:hAnsi="Calibri"/>
+          <w:color w:val="1E1C1C"/>
+          <w:sz w:val="21"/>
+        </w:rPr>
+        <w:t>Spotify Authorization: https://developer.spotify.com/documentation/web-api/concepts/authorization</w:t>
+      </w:r>
+    </w:p>
+    <w:p>
+      <w:pPr>
+        <w:pStyle w:val="ListBullet"/>
+      </w:pPr>
+      <w:r>
+        <w:rPr>
+          <w:rFonts w:ascii="Calibri" w:hAnsi="Calibri"/>
+          <w:color w:val="1E1C1C"/>
+          <w:sz w:val="21"/>
+        </w:rPr>
+        <w:t>Apple MusicKit: https://developer.apple.com/documentation/musickit</w:t>
+      </w:r>
+    </w:p>
+    <w:p>
+      <w:pPr>
+        <w:pStyle w:val="ListBullet"/>
+      </w:pPr>
+      <w:r>
+        <w:rPr>
+          <w:rFonts w:ascii="Calibri" w:hAnsi="Calibri"/>
+          <w:color w:val="1E1C1C"/>
+          <w:sz w:val="21"/>
+        </w:rPr>
+        <w:t>Apple MusicKit ApplicationMusicPlayer: https://developer.apple.com/documentation/musickit/applicationmusicplayer</w:t>
+      </w:r>
+    </w:p>
+    <w:p>
+      <w:pPr>
+        <w:pStyle w:val="ListBullet"/>
+      </w:pPr>
+      <w:r>
+        <w:rPr>
+          <w:rFonts w:ascii="Calibri" w:hAnsi="Calibri"/>
+          <w:color w:val="1E1C1C"/>
+          <w:sz w:val="21"/>
+        </w:rPr>
+        <w:t>Apple MusicKit catalog search: https://developer.apple.com/documentation/musickit/musiccatalogsearchrequest</w:t>
+      </w:r>
+    </w:p>
+    <w:p>
+      <w:pPr>
         <w:pStyle w:val="Heading1"/>
       </w:pPr>
       <w:r>
@@ -20818,6 +24525,45 @@
           <w:sz w:val="21"/>
         </w:rPr>
         <w:t>Sonny must preserve tasteful product quality.</w:t>
+      </w:r>
+    </w:p>
+    <w:p>
+      <w:pPr>
+        <w:pStyle w:val="ListBullet"/>
+      </w:pPr>
+      <w:r>
+        <w:rPr>
+          <w:rFonts w:ascii="Calibri" w:hAnsi="Calibri"/>
+          <w:color w:val="1E1C1C"/>
+          <w:sz w:val="21"/>
+        </w:rPr>
+        <w:t>Sonny must not leave the menu-bar widget as the only product surface.</w:t>
+      </w:r>
+    </w:p>
+    <w:p>
+      <w:pPr>
+        <w:pStyle w:val="ListBullet"/>
+      </w:pPr>
+      <w:r>
+        <w:rPr>
+          <w:rFonts w:ascii="Calibri" w:hAnsi="Calibri"/>
+          <w:color w:val="1E1C1C"/>
+          <w:sz w:val="21"/>
+        </w:rPr>
+        <w:t>Sonny must generalize prototype features before pretending the major-release architecture is ready.</w:t>
+      </w:r>
+    </w:p>
+    <w:p>
+      <w:pPr>
+        <w:pStyle w:val="ListBullet"/>
+      </w:pPr>
+      <w:r>
+        <w:rPr>
+          <w:rFonts w:ascii="Calibri" w:hAnsi="Calibri"/>
+          <w:color w:val="1E1C1C"/>
+          <w:sz w:val="21"/>
+        </w:rPr>
+        <w:t>Sonny must use provider APIs for media playback where possible and explain fallbacks clearly.</w:t>
       </w:r>
     </w:p>
     <w:p/>

</xml_diff>